<commit_message>
Refine manuscript and replies to report completed analyses directly
</commit_message>
<xml_diff>
--- a/review/revision-1/Response-to-Reviewer-1-EN-ZH.docx
+++ b/review/revision-1/Response-to-Reviewer-1-EN-ZH.docx
@@ -32,18 +32,18 @@
           </w:tcPr>
           <w:p>
             <w:pPr>
-              <w:rPr>
-                <w:rFonts w:ascii="Palatino Linotype" w:hAnsi="Palatino Linotype"/>
-                <w:i/>
-                <w:iCs/>
-                <w:color w:val="FF0000"/>
-              </w:rPr>
               <w:pStyle w:val="Title"/>
-              <w:widowControl w:val="1"/>
-              <w:keepLines/>
+              <w:keepNext w:val="1"/>
+              <w:keepLines/>
+              <w:widowControl w:val="1"/>
               <w:snapToGrid w:val="0"/>
               <w:spacing w:before="0" w:after="60" w:line="260" w:lineRule="auto"/>
-              <w:keepNext w:val="1"/>
+              <w:rPr>
+                <w:rFonts w:ascii="Palatino Linotype" w:hAnsi="Palatino Linotype"/>
+                <w:i/>
+                <w:iCs/>
+                <w:color w:val="FF0000"/>
+              </w:rPr>
             </w:pPr>
             <w:r>
               <w:rPr>
@@ -55,23 +55,24 @@
           </w:p>
           <w:p>
             <w:pPr>
-              <w:rPr>
-                <w:rFonts w:ascii="Palatino Linotype" w:hAnsi="Palatino Linotype"/>
-                <w:i/>
-                <w:iCs/>
-                <w:color w:val="FF0000"/>
-              </w:rPr>
               <w:pStyle w:val="Title"/>
               <w:keepNext/>
               <w:keepLines/>
+              <w:widowControl w:val="1"/>
+              <w:wordWrap w:val="0"/>
               <w:snapToGrid w:val="0"/>
               <w:spacing w:before="0" w:after="100" w:line="500" w:lineRule="exact"/>
-              <w:widowControl w:val="1"/>
+              <w:rPr>
+                <w:rFonts w:ascii="Palatino Linotype" w:hAnsi="Palatino Linotype"/>
+                <w:i/>
+                <w:iCs/>
+                <w:color w:val="FF0000"/>
+              </w:rPr>
             </w:pPr>
             <w:r>
               <w:rPr>
                 <w:rFonts w:ascii="Palatino Linotype" w:hAnsi="Palatino Linotype" w:eastAsia="SimSun" w:cs="Palatino Linotype"/>
-                <w:lang w:val="zh-CN" w:eastAsia="zh-CN"/>
+                <w:lang w:val="en-US" w:eastAsia="zh-CN"/>
                 <w:sz w:val="40"/>
                 <w:szCs w:val="40"/>
                 <w:color w:val="000000"/>
@@ -92,18 +93,18 @@
           </w:tcPr>
           <w:p>
             <w:pPr>
-              <w:rPr>
-                <w:rFonts w:ascii="Palatino Linotype" w:hAnsi="Palatino Linotype"/>
-                <w:i/>
-                <w:iCs/>
-                <w:color w:val="FF0000"/>
-              </w:rPr>
-              <w:pStyle w:val="Normal"/>
-              <w:widowControl w:val="1"/>
-              <w:keepLines/>
+              <w:pStyle w:val="Normal"/>
+              <w:keepNext w:val="1"/>
+              <w:keepLines/>
+              <w:widowControl w:val="1"/>
               <w:snapToGrid w:val="0"/>
               <w:spacing w:before="0" w:after="60" w:line="300" w:lineRule="exact"/>
-              <w:keepNext w:val="1"/>
+              <w:rPr>
+                <w:rFonts w:ascii="Palatino Linotype" w:hAnsi="Palatino Linotype"/>
+                <w:i/>
+                <w:iCs/>
+                <w:color w:val="FF0000"/>
+              </w:rPr>
             </w:pPr>
             <w:r>
               <w:rPr>
@@ -118,25 +119,26 @@
           </w:p>
           <w:p>
             <w:pPr>
-              <w:rPr>
-                <w:rFonts w:ascii="Palatino Linotype" w:hAnsi="Palatino Linotype"/>
-                <w:i/>
-                <w:iCs/>
-                <w:color w:val="FF0000"/>
-              </w:rPr>
               <w:pStyle w:val="Normal"/>
               <w:keepNext/>
               <w:keepLines/>
+              <w:widowControl w:val="1"/>
+              <w:wordWrap w:val="0"/>
               <w:snapToGrid w:val="0"/>
               <w:spacing w:before="0" w:after="100" w:line="300" w:lineRule="exact"/>
-              <w:widowControl w:val="1"/>
+              <w:rPr>
+                <w:rFonts w:ascii="Palatino Linotype" w:hAnsi="Palatino Linotype"/>
+                <w:i/>
+                <w:iCs/>
+                <w:color w:val="FF0000"/>
+              </w:rPr>
             </w:pPr>
             <w:r>
               <w:rPr>
                 <w:color w:val="000000"/>
                 <w:b/>
                 <w:rFonts w:ascii="Palatino Linotype" w:hAnsi="Palatino Linotype" w:eastAsia="SimSun" w:cs="Palatino Linotype"/>
-                <w:lang w:val="zh-CN" w:eastAsia="zh-CN"/>
+                <w:lang w:val="en-US" w:eastAsia="zh-CN"/>
                 <w:sz w:val="23"/>
                 <w:szCs w:val="23"/>
               </w:rPr>
@@ -156,18 +158,18 @@
           </w:tcPr>
           <w:p>
             <w:pPr>
-              <w:rPr>
-                <w:rFonts w:ascii="Palatino Linotype" w:hAnsi="Palatino Linotype"/>
-                <w:i/>
-                <w:iCs/>
-                <w:color w:val="FF0000"/>
-              </w:rPr>
-              <w:pStyle w:val="Normal"/>
-              <w:widowControl w:val="1"/>
-              <w:keepLines/>
+              <w:pStyle w:val="Normal"/>
+              <w:keepNext w:val="1"/>
+              <w:keepLines/>
+              <w:widowControl w:val="1"/>
               <w:snapToGrid w:val="0"/>
               <w:spacing w:before="0" w:after="60" w:line="300" w:lineRule="exact"/>
-              <w:keepNext w:val="1"/>
+              <w:rPr>
+                <w:rFonts w:ascii="Palatino Linotype" w:hAnsi="Palatino Linotype"/>
+                <w:i/>
+                <w:iCs/>
+                <w:color w:val="FF0000"/>
+              </w:rPr>
             </w:pPr>
             <w:r>
               <w:rPr>
@@ -176,32 +178,33 @@
                 <w:sz w:val="23"/>
                 <w:szCs w:val="23"/>
               </w:rPr>
-              <w:t xml:space="preserve">Thank you for reviewing the manuscript. The revision applies OAL to a disclosed full-text sample, adds a partition–revocation–reconciliation case and a specified ledger application, strengthens the witnessed-log comparison and consensus selection, and consolidates the discussion. Section, table and figure references below refer to the revised manuscript.</w:t>
-            </w:r>
-          </w:p>
-          <w:p>
-            <w:pPr>
-              <w:rPr>
-                <w:rFonts w:ascii="Palatino Linotype" w:hAnsi="Palatino Linotype"/>
-                <w:i/>
-                <w:iCs/>
-                <w:color w:val="FF0000"/>
-              </w:rPr>
-              <w:pStyle w:val="Normal"/>
-              <w:keepLines/>
+              <w:t xml:space="preserve">Thank you for reviewing the manuscript. We have applied OAL to 39 full-text mechanism studies, added a partition–revocation–reconciliation case and a specified ledger application, strengthened the witnessed-log comparison and consensus selection, and consolidated the discussion. Section, table and figure references below refer to the revised manuscript.</w:t>
+            </w:r>
+          </w:p>
+          <w:p>
+            <w:pPr>
+              <w:pStyle w:val="Normal"/>
+              <w:keepLines/>
+              <w:widowControl w:val="1"/>
+              <w:wordWrap w:val="0"/>
               <w:snapToGrid w:val="0"/>
               <w:spacing w:before="0" w:after="100" w:line="300" w:lineRule="exact"/>
-              <w:widowControl w:val="1"/>
+              <w:rPr>
+                <w:rFonts w:ascii="Palatino Linotype" w:hAnsi="Palatino Linotype"/>
+                <w:i/>
+                <w:iCs/>
+                <w:color w:val="FF0000"/>
+              </w:rPr>
             </w:pPr>
             <w:r>
               <w:rPr>
                 <w:color w:val="000000"/>
                 <w:rFonts w:ascii="Palatino Linotype" w:hAnsi="Palatino Linotype" w:eastAsia="SimSun" w:cs="Palatino Linotype"/>
-                <w:lang w:val="zh-CN" w:eastAsia="zh-CN"/>
-                <w:sz w:val="23"/>
-                <w:szCs w:val="23"/>
-              </w:rPr>
-              <w:t xml:space="preserve">感谢您审阅本稿。修订稿将 OAL 应用于已明确说明的全文研究样本，新增了分区—撤销—协调恢复案例和具体的账本应用方案，强化了见证日志基线比较与共识选型，并整合了讨论。下文引用的章节、表格和图均对应修订稿。</w:t>
+                <w:lang w:val="en-US" w:eastAsia="zh-CN"/>
+                <w:sz w:val="23"/>
+                <w:szCs w:val="23"/>
+              </w:rPr>
+              <w:t xml:space="preserve">感谢您审阅本稿。我们已将 OAL 应用于 39 篇经全文核查的机制研究，补充了分区—撤销—协调恢复案例及具体的账本应用方案，强化了见证日志比较和共识选型，并整合了讨论。下文引用的章节、表格和图均对应修订稿。</w:t>
             </w:r>
           </w:p>
         </w:tc>
@@ -216,14 +219,14 @@
           </w:tcPr>
           <w:p>
             <w:pPr>
+              <w:keepNext w:val="1"/>
+              <w:snapToGrid w:val="0"/>
+              <w:spacing w:before="0" w:after="60" w:line="300" w:lineRule="exact"/>
               <w:rPr>
                 <w:rFonts w:ascii="Palatino Linotype" w:hAnsi="Palatino Linotype"/>
                 <w:b/>
                 <w:bCs/>
               </w:rPr>
-              <w:snapToGrid w:val="0"/>
-              <w:spacing w:before="0" w:after="60" w:line="300" w:lineRule="exact"/>
-              <w:keepNext w:val="1"/>
             </w:pPr>
             <w:r>
               <w:rPr>
@@ -236,21 +239,22 @@
           </w:p>
           <w:p>
             <w:pPr>
+              <w:widowControl w:val="1"/>
+              <w:wordWrap w:val="0"/>
+              <w:snapToGrid w:val="0"/>
+              <w:spacing w:before="0" w:after="100" w:line="300" w:lineRule="exact"/>
               <w:rPr>
                 <w:rFonts w:ascii="Palatino Linotype" w:hAnsi="Palatino Linotype"/>
                 <w:b/>
                 <w:bCs/>
               </w:rPr>
-              <w:snapToGrid w:val="0"/>
-              <w:spacing w:before="0" w:after="100" w:line="300" w:lineRule="exact"/>
-              <w:widowControl w:val="1"/>
             </w:pPr>
             <w:r>
               <w:rPr>
                 <w:b/>
                 <w:bCs/>
                 <w:rFonts w:ascii="Palatino Linotype" w:hAnsi="Palatino Linotype" w:eastAsia="SimSun" w:cs="Palatino Linotype"/>
-                <w:lang w:val="zh-CN" w:eastAsia="zh-CN"/>
+                <w:lang w:val="en-US" w:eastAsia="zh-CN"/>
                 <w:sz w:val="23"/>
                 <w:szCs w:val="23"/>
               </w:rPr>
@@ -264,14 +268,14 @@
           </w:tcPr>
           <w:p>
             <w:pPr>
+              <w:keepNext w:val="1"/>
+              <w:snapToGrid w:val="0"/>
+              <w:spacing w:before="0" w:after="60" w:line="300" w:lineRule="exact"/>
               <w:rPr>
                 <w:rFonts w:ascii="Palatino Linotype" w:hAnsi="Palatino Linotype"/>
                 <w:b/>
                 <w:bCs/>
               </w:rPr>
-              <w:snapToGrid w:val="0"/>
-              <w:spacing w:before="0" w:after="60" w:line="300" w:lineRule="exact"/>
-              <w:keepNext w:val="1"/>
             </w:pPr>
             <w:r>
               <w:rPr>
@@ -300,21 +304,22 @@
           </w:p>
           <w:p>
             <w:pPr>
+              <w:widowControl w:val="1"/>
+              <w:wordWrap w:val="0"/>
+              <w:snapToGrid w:val="0"/>
+              <w:spacing w:before="0" w:after="100" w:line="300" w:lineRule="exact"/>
               <w:rPr>
                 <w:rFonts w:ascii="Palatino Linotype" w:hAnsi="Palatino Linotype"/>
                 <w:b/>
                 <w:bCs/>
               </w:rPr>
-              <w:snapToGrid w:val="0"/>
-              <w:spacing w:before="0" w:after="100" w:line="300" w:lineRule="exact"/>
-              <w:widowControl w:val="1"/>
             </w:pPr>
             <w:r>
               <w:rPr>
                 <w:b/>
                 <w:bCs/>
                 <w:rFonts w:ascii="Palatino Linotype" w:hAnsi="Palatino Linotype" w:eastAsia="SimSun" w:cs="Palatino Linotype"/>
-                <w:lang w:val="zh-CN" w:eastAsia="zh-CN"/>
+                <w:lang w:val="en-US" w:eastAsia="zh-CN"/>
                 <w:sz w:val="23"/>
                 <w:szCs w:val="23"/>
               </w:rPr>
@@ -328,14 +333,14 @@
           </w:tcPr>
           <w:p>
             <w:pPr>
+              <w:keepNext w:val="1"/>
+              <w:snapToGrid w:val="0"/>
+              <w:spacing w:before="0" w:after="60" w:line="300" w:lineRule="exact"/>
               <w:rPr>
                 <w:rFonts w:ascii="Palatino Linotype" w:hAnsi="Palatino Linotype"/>
                 <w:b/>
                 <w:bCs/>
               </w:rPr>
-              <w:snapToGrid w:val="0"/>
-              <w:spacing w:before="0" w:after="60" w:line="300" w:lineRule="exact"/>
-              <w:keepNext w:val="1"/>
             </w:pPr>
             <w:r>
               <w:rPr>
@@ -348,21 +353,22 @@
           </w:p>
           <w:p>
             <w:pPr>
+              <w:widowControl w:val="1"/>
+              <w:wordWrap w:val="0"/>
+              <w:snapToGrid w:val="0"/>
+              <w:spacing w:before="0" w:after="100" w:line="300" w:lineRule="exact"/>
               <w:rPr>
                 <w:rFonts w:ascii="Palatino Linotype" w:hAnsi="Palatino Linotype"/>
                 <w:b/>
                 <w:bCs/>
               </w:rPr>
-              <w:snapToGrid w:val="0"/>
-              <w:spacing w:before="0" w:after="100" w:line="300" w:lineRule="exact"/>
-              <w:widowControl w:val="1"/>
             </w:pPr>
             <w:r>
               <w:rPr>
                 <w:b/>
                 <w:bCs/>
                 <w:rFonts w:ascii="Palatino Linotype" w:hAnsi="Palatino Linotype" w:eastAsia="SimSun" w:cs="Palatino Linotype"/>
-                <w:lang w:val="zh-CN" w:eastAsia="zh-CN"/>
+                <w:lang w:val="en-US" w:eastAsia="zh-CN"/>
                 <w:sz w:val="23"/>
                 <w:szCs w:val="23"/>
               </w:rPr>
@@ -381,18 +387,18 @@
           </w:tcPr>
           <w:p>
             <w:pPr>
-              <w:rPr>
-                <w:rFonts w:ascii="Palatino Linotype" w:hAnsi="Palatino Linotype"/>
-                <w:i/>
-                <w:iCs/>
-                <w:color w:val="FF0000"/>
-              </w:rPr>
-              <w:pStyle w:val="Normal"/>
-              <w:widowControl w:val="1"/>
-              <w:keepLines/>
+              <w:pStyle w:val="Normal"/>
+              <w:keepNext w:val="1"/>
+              <w:keepLines/>
+              <w:widowControl w:val="1"/>
               <w:snapToGrid w:val="0"/>
               <w:spacing w:before="0" w:after="60" w:line="300" w:lineRule="exact"/>
-              <w:keepNext w:val="1"/>
+              <w:rPr>
+                <w:rFonts w:ascii="Palatino Linotype" w:hAnsi="Palatino Linotype"/>
+                <w:i/>
+                <w:iCs/>
+                <w:color w:val="FF0000"/>
+              </w:rPr>
             </w:pPr>
             <w:r>
               <w:rPr>
@@ -406,23 +412,24 @@
           </w:p>
           <w:p>
             <w:pPr>
-              <w:rPr>
-                <w:rFonts w:ascii="Palatino Linotype" w:hAnsi="Palatino Linotype"/>
-                <w:i/>
-                <w:iCs/>
-                <w:color w:val="FF0000"/>
-              </w:rPr>
-              <w:pStyle w:val="Normal"/>
-              <w:keepLines/>
+              <w:pStyle w:val="Normal"/>
+              <w:keepLines/>
+              <w:widowControl w:val="1"/>
+              <w:wordWrap w:val="0"/>
               <w:snapToGrid w:val="0"/>
               <w:spacing w:before="0" w:after="100" w:line="300" w:lineRule="exact"/>
-              <w:widowControl w:val="1"/>
+              <w:rPr>
+                <w:rFonts w:ascii="Palatino Linotype" w:hAnsi="Palatino Linotype"/>
+                <w:i/>
+                <w:iCs/>
+                <w:color w:val="FF0000"/>
+              </w:rPr>
             </w:pPr>
             <w:r>
               <w:rPr>
                 <w:color w:val="000000"/>
                 <w:rFonts w:ascii="Palatino Linotype" w:hAnsi="Palatino Linotype" w:eastAsia="SimSun" w:cs="Palatino Linotype"/>
-                <w:lang w:val="zh-CN" w:eastAsia="zh-CN"/>
+                <w:lang w:val="en-US" w:eastAsia="zh-CN"/>
                 <w:sz w:val="23"/>
                 <w:szCs w:val="23"/>
               </w:rPr>
@@ -436,18 +443,18 @@
           </w:tcPr>
           <w:p>
             <w:pPr>
-              <w:rPr>
-                <w:rFonts w:ascii="Palatino Linotype" w:hAnsi="Palatino Linotype"/>
-                <w:i/>
-                <w:iCs/>
-                <w:color w:val="FF0000"/>
-              </w:rPr>
-              <w:pStyle w:val="Normal"/>
-              <w:widowControl w:val="1"/>
-              <w:keepLines/>
+              <w:pStyle w:val="Normal"/>
+              <w:keepNext w:val="1"/>
+              <w:keepLines/>
+              <w:widowControl w:val="1"/>
               <w:snapToGrid w:val="0"/>
               <w:spacing w:before="0" w:after="60" w:line="300" w:lineRule="exact"/>
-              <w:keepNext w:val="1"/>
+              <w:rPr>
+                <w:rFonts w:ascii="Palatino Linotype" w:hAnsi="Palatino Linotype"/>
+                <w:i/>
+                <w:iCs/>
+                <w:color w:val="FF0000"/>
+              </w:rPr>
             </w:pPr>
             <w:r>
               <w:rPr>
@@ -461,23 +468,24 @@
           </w:p>
           <w:p>
             <w:pPr>
-              <w:rPr>
-                <w:rFonts w:ascii="Palatino Linotype" w:hAnsi="Palatino Linotype"/>
-                <w:i/>
-                <w:iCs/>
-                <w:color w:val="FF0000"/>
-              </w:rPr>
-              <w:pStyle w:val="Normal"/>
-              <w:keepLines/>
+              <w:pStyle w:val="Normal"/>
+              <w:keepLines/>
+              <w:widowControl w:val="1"/>
+              <w:wordWrap w:val="0"/>
               <w:snapToGrid w:val="0"/>
               <w:spacing w:before="0" w:after="100" w:line="300" w:lineRule="exact"/>
-              <w:widowControl w:val="1"/>
+              <w:rPr>
+                <w:rFonts w:ascii="Palatino Linotype" w:hAnsi="Palatino Linotype"/>
+                <w:i/>
+                <w:iCs/>
+                <w:color w:val="FF0000"/>
+              </w:rPr>
             </w:pPr>
             <w:r>
               <w:rPr>
                 <w:color w:val="000000"/>
                 <w:rFonts w:ascii="Palatino Linotype" w:hAnsi="Palatino Linotype" w:eastAsia="SimSun" w:cs="Palatino Linotype"/>
-                <w:lang w:val="zh-CN" w:eastAsia="zh-CN"/>
+                <w:lang w:val="en-US" w:eastAsia="zh-CN"/>
                 <w:sz w:val="23"/>
                 <w:szCs w:val="23"/>
               </w:rPr>
@@ -491,18 +499,18 @@
           </w:tcPr>
           <w:p>
             <w:pPr>
-              <w:rPr>
-                <w:rFonts w:ascii="Palatino Linotype" w:hAnsi="Palatino Linotype"/>
-                <w:i/>
-                <w:iCs/>
-                <w:color w:val="FF0000"/>
-              </w:rPr>
-              <w:pStyle w:val="Normal"/>
-              <w:widowControl w:val="1"/>
-              <w:keepLines/>
+              <w:pStyle w:val="Normal"/>
+              <w:keepNext w:val="1"/>
+              <w:keepLines/>
+              <w:widowControl w:val="1"/>
               <w:snapToGrid w:val="0"/>
               <w:spacing w:before="0" w:after="60" w:line="300" w:lineRule="exact"/>
-              <w:keepNext w:val="1"/>
+              <w:rPr>
+                <w:rFonts w:ascii="Palatino Linotype" w:hAnsi="Palatino Linotype"/>
+                <w:i/>
+                <w:iCs/>
+                <w:color w:val="FF0000"/>
+              </w:rPr>
             </w:pPr>
             <w:r>
               <w:rPr>
@@ -516,23 +524,24 @@
           </w:p>
           <w:p>
             <w:pPr>
-              <w:rPr>
-                <w:rFonts w:ascii="Palatino Linotype" w:hAnsi="Palatino Linotype"/>
-                <w:i/>
-                <w:iCs/>
-                <w:color w:val="FF0000"/>
-              </w:rPr>
-              <w:pStyle w:val="Normal"/>
-              <w:keepLines/>
+              <w:pStyle w:val="Normal"/>
+              <w:keepLines/>
+              <w:widowControl w:val="1"/>
+              <w:wordWrap w:val="0"/>
               <w:snapToGrid w:val="0"/>
               <w:spacing w:before="0" w:after="100" w:line="300" w:lineRule="exact"/>
-              <w:widowControl w:val="1"/>
+              <w:rPr>
+                <w:rFonts w:ascii="Palatino Linotype" w:hAnsi="Palatino Linotype"/>
+                <w:i/>
+                <w:iCs/>
+                <w:color w:val="FF0000"/>
+              </w:rPr>
             </w:pPr>
             <w:r>
               <w:rPr>
                 <w:color w:val="FF0000"/>
                 <w:rFonts w:ascii="Palatino Linotype" w:hAnsi="Palatino Linotype" w:eastAsia="SimSun" w:cs="Palatino Linotype"/>
-                <w:lang w:val="zh-CN" w:eastAsia="zh-CN"/>
+                <w:lang w:val="en-US" w:eastAsia="zh-CN"/>
                 <w:sz w:val="23"/>
                 <w:szCs w:val="23"/>
               </w:rPr>
@@ -551,18 +560,18 @@
           </w:tcPr>
           <w:p>
             <w:pPr>
-              <w:rPr>
-                <w:rFonts w:ascii="Palatino Linotype" w:hAnsi="Palatino Linotype"/>
-                <w:i/>
-                <w:iCs/>
-                <w:color w:val="FF0000"/>
-              </w:rPr>
-              <w:pStyle w:val="Normal"/>
-              <w:widowControl w:val="1"/>
-              <w:keepLines/>
+              <w:pStyle w:val="Normal"/>
+              <w:keepNext w:val="1"/>
+              <w:keepLines/>
+              <w:widowControl w:val="1"/>
               <w:snapToGrid w:val="0"/>
               <w:spacing w:before="0" w:after="60" w:line="300" w:lineRule="exact"/>
-              <w:keepNext w:val="1"/>
+              <w:rPr>
+                <w:rFonts w:ascii="Palatino Linotype" w:hAnsi="Palatino Linotype"/>
+                <w:i/>
+                <w:iCs/>
+                <w:color w:val="FF0000"/>
+              </w:rPr>
             </w:pPr>
             <w:r>
               <w:rPr>
@@ -576,23 +585,24 @@
           </w:p>
           <w:p>
             <w:pPr>
-              <w:rPr>
-                <w:rFonts w:ascii="Palatino Linotype" w:hAnsi="Palatino Linotype"/>
-                <w:i/>
-                <w:iCs/>
-                <w:color w:val="FF0000"/>
-              </w:rPr>
-              <w:pStyle w:val="Normal"/>
-              <w:keepLines/>
+              <w:pStyle w:val="Normal"/>
+              <w:keepLines/>
+              <w:widowControl w:val="1"/>
+              <w:wordWrap w:val="0"/>
               <w:snapToGrid w:val="0"/>
               <w:spacing w:before="0" w:after="100" w:line="300" w:lineRule="exact"/>
-              <w:widowControl w:val="1"/>
+              <w:rPr>
+                <w:rFonts w:ascii="Palatino Linotype" w:hAnsi="Palatino Linotype"/>
+                <w:i/>
+                <w:iCs/>
+                <w:color w:val="FF0000"/>
+              </w:rPr>
             </w:pPr>
             <w:r>
               <w:rPr>
                 <w:color w:val="000000"/>
                 <w:rFonts w:ascii="Palatino Linotype" w:hAnsi="Palatino Linotype" w:eastAsia="SimSun" w:cs="Palatino Linotype"/>
-                <w:lang w:val="zh-CN" w:eastAsia="zh-CN"/>
+                <w:lang w:val="en-US" w:eastAsia="zh-CN"/>
                 <w:sz w:val="23"/>
                 <w:szCs w:val="23"/>
               </w:rPr>
@@ -606,18 +616,18 @@
           </w:tcPr>
           <w:p>
             <w:pPr>
-              <w:rPr>
-                <w:rFonts w:ascii="Palatino Linotype" w:hAnsi="Palatino Linotype"/>
-                <w:i/>
-                <w:iCs/>
-                <w:color w:val="FF0000"/>
-              </w:rPr>
-              <w:pStyle w:val="Normal"/>
-              <w:widowControl w:val="1"/>
-              <w:keepLines/>
+              <w:pStyle w:val="Normal"/>
+              <w:keepNext w:val="1"/>
+              <w:keepLines/>
+              <w:widowControl w:val="1"/>
               <w:snapToGrid w:val="0"/>
               <w:spacing w:before="0" w:after="60" w:line="300" w:lineRule="exact"/>
-              <w:keepNext w:val="1"/>
+              <w:rPr>
+                <w:rFonts w:ascii="Palatino Linotype" w:hAnsi="Palatino Linotype"/>
+                <w:i/>
+                <w:iCs/>
+                <w:color w:val="FF0000"/>
+              </w:rPr>
             </w:pPr>
             <w:r>
               <w:rPr>
@@ -631,23 +641,24 @@
           </w:p>
           <w:p>
             <w:pPr>
-              <w:rPr>
-                <w:rFonts w:ascii="Palatino Linotype" w:hAnsi="Palatino Linotype"/>
-                <w:i/>
-                <w:iCs/>
-                <w:color w:val="FF0000"/>
-              </w:rPr>
-              <w:pStyle w:val="Normal"/>
-              <w:keepLines/>
+              <w:pStyle w:val="Normal"/>
+              <w:keepLines/>
+              <w:widowControl w:val="1"/>
+              <w:wordWrap w:val="0"/>
               <w:snapToGrid w:val="0"/>
               <w:spacing w:before="0" w:after="100" w:line="300" w:lineRule="exact"/>
-              <w:widowControl w:val="1"/>
+              <w:rPr>
+                <w:rFonts w:ascii="Palatino Linotype" w:hAnsi="Palatino Linotype"/>
+                <w:i/>
+                <w:iCs/>
+                <w:color w:val="FF0000"/>
+              </w:rPr>
             </w:pPr>
             <w:r>
               <w:rPr>
                 <w:color w:val="000000"/>
                 <w:rFonts w:ascii="Palatino Linotype" w:hAnsi="Palatino Linotype" w:eastAsia="SimSun" w:cs="Palatino Linotype"/>
-                <w:lang w:val="zh-CN" w:eastAsia="zh-CN"/>
+                <w:lang w:val="en-US" w:eastAsia="zh-CN"/>
                 <w:sz w:val="23"/>
                 <w:szCs w:val="23"/>
               </w:rPr>
@@ -661,18 +672,18 @@
           </w:tcPr>
           <w:p>
             <w:pPr>
-              <w:rPr>
-                <w:rFonts w:ascii="Palatino Linotype" w:hAnsi="Palatino Linotype"/>
-                <w:i/>
-                <w:iCs/>
-                <w:color w:val="FF0000"/>
-              </w:rPr>
-              <w:pStyle w:val="Normal"/>
-              <w:widowControl w:val="1"/>
-              <w:keepLines/>
+              <w:pStyle w:val="Normal"/>
+              <w:keepNext w:val="1"/>
+              <w:keepLines/>
+              <w:widowControl w:val="1"/>
               <w:snapToGrid w:val="0"/>
               <w:spacing w:before="0" w:after="60" w:line="300" w:lineRule="exact"/>
-              <w:keepNext w:val="1"/>
+              <w:rPr>
+                <w:rFonts w:ascii="Palatino Linotype" w:hAnsi="Palatino Linotype"/>
+                <w:i/>
+                <w:iCs/>
+                <w:color w:val="FF0000"/>
+              </w:rPr>
             </w:pPr>
             <w:r>
               <w:rPr>
@@ -686,23 +697,24 @@
           </w:p>
           <w:p>
             <w:pPr>
-              <w:rPr>
-                <w:rFonts w:ascii="Palatino Linotype" w:hAnsi="Palatino Linotype"/>
-                <w:i/>
-                <w:iCs/>
-                <w:color w:val="FF0000"/>
-              </w:rPr>
-              <w:pStyle w:val="Normal"/>
-              <w:keepLines/>
+              <w:pStyle w:val="Normal"/>
+              <w:keepLines/>
+              <w:widowControl w:val="1"/>
+              <w:wordWrap w:val="0"/>
               <w:snapToGrid w:val="0"/>
               <w:spacing w:before="0" w:after="100" w:line="300" w:lineRule="exact"/>
-              <w:widowControl w:val="1"/>
+              <w:rPr>
+                <w:rFonts w:ascii="Palatino Linotype" w:hAnsi="Palatino Linotype"/>
+                <w:i/>
+                <w:iCs/>
+                <w:color w:val="FF0000"/>
+              </w:rPr>
             </w:pPr>
             <w:r>
               <w:rPr>
                 <w:color w:val="FF0000"/>
                 <w:rFonts w:ascii="Palatino Linotype" w:hAnsi="Palatino Linotype" w:eastAsia="SimSun" w:cs="Palatino Linotype"/>
-                <w:lang w:val="zh-CN" w:eastAsia="zh-CN"/>
+                <w:lang w:val="en-US" w:eastAsia="zh-CN"/>
                 <w:sz w:val="23"/>
                 <w:szCs w:val="23"/>
               </w:rPr>
@@ -721,18 +733,18 @@
           </w:tcPr>
           <w:p>
             <w:pPr>
-              <w:rPr>
-                <w:rFonts w:ascii="Palatino Linotype" w:hAnsi="Palatino Linotype"/>
-                <w:i/>
-                <w:iCs/>
-                <w:color w:val="FF0000"/>
-              </w:rPr>
-              <w:pStyle w:val="Normal"/>
-              <w:widowControl w:val="1"/>
-              <w:keepLines/>
+              <w:pStyle w:val="Normal"/>
+              <w:keepNext w:val="1"/>
+              <w:keepLines/>
+              <w:widowControl w:val="1"/>
               <w:snapToGrid w:val="0"/>
               <w:spacing w:before="0" w:after="60" w:line="300" w:lineRule="exact"/>
-              <w:keepNext w:val="1"/>
+              <w:rPr>
+                <w:rFonts w:ascii="Palatino Linotype" w:hAnsi="Palatino Linotype"/>
+                <w:i/>
+                <w:iCs/>
+                <w:color w:val="FF0000"/>
+              </w:rPr>
             </w:pPr>
             <w:r>
               <w:rPr>
@@ -746,23 +758,24 @@
           </w:p>
           <w:p>
             <w:pPr>
-              <w:rPr>
-                <w:rFonts w:ascii="Palatino Linotype" w:hAnsi="Palatino Linotype"/>
-                <w:i/>
-                <w:iCs/>
-                <w:color w:val="FF0000"/>
-              </w:rPr>
-              <w:pStyle w:val="Normal"/>
-              <w:keepLines/>
+              <w:pStyle w:val="Normal"/>
+              <w:keepLines/>
+              <w:widowControl w:val="1"/>
+              <w:wordWrap w:val="0"/>
               <w:snapToGrid w:val="0"/>
               <w:spacing w:before="0" w:after="100" w:line="300" w:lineRule="exact"/>
-              <w:widowControl w:val="1"/>
+              <w:rPr>
+                <w:rFonts w:ascii="Palatino Linotype" w:hAnsi="Palatino Linotype"/>
+                <w:i/>
+                <w:iCs/>
+                <w:color w:val="FF0000"/>
+              </w:rPr>
             </w:pPr>
             <w:r>
               <w:rPr>
                 <w:color w:val="000000"/>
                 <w:rFonts w:ascii="Palatino Linotype" w:hAnsi="Palatino Linotype" w:eastAsia="SimSun" w:cs="Palatino Linotype"/>
-                <w:lang w:val="zh-CN" w:eastAsia="zh-CN"/>
+                <w:lang w:val="en-US" w:eastAsia="zh-CN"/>
                 <w:sz w:val="23"/>
                 <w:szCs w:val="23"/>
               </w:rPr>
@@ -776,18 +789,18 @@
           </w:tcPr>
           <w:p>
             <w:pPr>
-              <w:rPr>
-                <w:rFonts w:ascii="Palatino Linotype" w:hAnsi="Palatino Linotype"/>
-                <w:i/>
-                <w:iCs/>
-                <w:color w:val="FF0000"/>
-              </w:rPr>
-              <w:pStyle w:val="Normal"/>
-              <w:widowControl w:val="1"/>
-              <w:keepLines/>
+              <w:pStyle w:val="Normal"/>
+              <w:keepNext w:val="1"/>
+              <w:keepLines/>
+              <w:widowControl w:val="1"/>
               <w:snapToGrid w:val="0"/>
               <w:spacing w:before="0" w:after="60" w:line="300" w:lineRule="exact"/>
-              <w:keepNext w:val="1"/>
+              <w:rPr>
+                <w:rFonts w:ascii="Palatino Linotype" w:hAnsi="Palatino Linotype"/>
+                <w:i/>
+                <w:iCs/>
+                <w:color w:val="FF0000"/>
+              </w:rPr>
             </w:pPr>
             <w:r>
               <w:rPr>
@@ -801,23 +814,24 @@
           </w:p>
           <w:p>
             <w:pPr>
-              <w:rPr>
-                <w:rFonts w:ascii="Palatino Linotype" w:hAnsi="Palatino Linotype"/>
-                <w:i/>
-                <w:iCs/>
-                <w:color w:val="FF0000"/>
-              </w:rPr>
-              <w:pStyle w:val="Normal"/>
-              <w:keepLines/>
+              <w:pStyle w:val="Normal"/>
+              <w:keepLines/>
+              <w:widowControl w:val="1"/>
+              <w:wordWrap w:val="0"/>
               <w:snapToGrid w:val="0"/>
               <w:spacing w:before="0" w:after="100" w:line="300" w:lineRule="exact"/>
-              <w:widowControl w:val="1"/>
+              <w:rPr>
+                <w:rFonts w:ascii="Palatino Linotype" w:hAnsi="Palatino Linotype"/>
+                <w:i/>
+                <w:iCs/>
+                <w:color w:val="FF0000"/>
+              </w:rPr>
             </w:pPr>
             <w:r>
               <w:rPr>
                 <w:color w:val="000000"/>
                 <w:rFonts w:ascii="Palatino Linotype" w:hAnsi="Palatino Linotype" w:eastAsia="SimSun" w:cs="Palatino Linotype"/>
-                <w:lang w:val="zh-CN" w:eastAsia="zh-CN"/>
+                <w:lang w:val="en-US" w:eastAsia="zh-CN"/>
                 <w:sz w:val="23"/>
                 <w:szCs w:val="23"/>
               </w:rPr>
@@ -831,18 +845,18 @@
           </w:tcPr>
           <w:p>
             <w:pPr>
-              <w:rPr>
-                <w:rFonts w:ascii="Palatino Linotype" w:hAnsi="Palatino Linotype"/>
-                <w:i/>
-                <w:iCs/>
-                <w:color w:val="FF0000"/>
-              </w:rPr>
-              <w:pStyle w:val="Normal"/>
-              <w:widowControl w:val="1"/>
-              <w:keepLines/>
+              <w:pStyle w:val="Normal"/>
+              <w:keepNext w:val="1"/>
+              <w:keepLines/>
+              <w:widowControl w:val="1"/>
               <w:snapToGrid w:val="0"/>
               <w:spacing w:before="0" w:after="60" w:line="300" w:lineRule="exact"/>
-              <w:keepNext w:val="1"/>
+              <w:rPr>
+                <w:rFonts w:ascii="Palatino Linotype" w:hAnsi="Palatino Linotype"/>
+                <w:i/>
+                <w:iCs/>
+                <w:color w:val="FF0000"/>
+              </w:rPr>
             </w:pPr>
             <w:r>
               <w:rPr>
@@ -856,23 +870,24 @@
           </w:p>
           <w:p>
             <w:pPr>
-              <w:rPr>
-                <w:rFonts w:ascii="Palatino Linotype" w:hAnsi="Palatino Linotype"/>
-                <w:i/>
-                <w:iCs/>
-                <w:color w:val="FF0000"/>
-              </w:rPr>
-              <w:pStyle w:val="Normal"/>
-              <w:keepLines/>
+              <w:pStyle w:val="Normal"/>
+              <w:keepLines/>
+              <w:widowControl w:val="1"/>
+              <w:wordWrap w:val="0"/>
               <w:snapToGrid w:val="0"/>
               <w:spacing w:before="0" w:after="100" w:line="300" w:lineRule="exact"/>
-              <w:widowControl w:val="1"/>
+              <w:rPr>
+                <w:rFonts w:ascii="Palatino Linotype" w:hAnsi="Palatino Linotype"/>
+                <w:i/>
+                <w:iCs/>
+                <w:color w:val="FF0000"/>
+              </w:rPr>
             </w:pPr>
             <w:r>
               <w:rPr>
                 <w:color w:val="FF0000"/>
                 <w:rFonts w:ascii="Palatino Linotype" w:hAnsi="Palatino Linotype" w:eastAsia="SimSun" w:cs="Palatino Linotype"/>
-                <w:lang w:val="zh-CN" w:eastAsia="zh-CN"/>
+                <w:lang w:val="en-US" w:eastAsia="zh-CN"/>
                 <w:sz w:val="23"/>
                 <w:szCs w:val="23"/>
               </w:rPr>
@@ -891,18 +906,18 @@
           </w:tcPr>
           <w:p>
             <w:pPr>
-              <w:rPr>
-                <w:rFonts w:ascii="Palatino Linotype" w:hAnsi="Palatino Linotype"/>
-                <w:i/>
-                <w:iCs/>
-                <w:color w:val="FF0000"/>
-              </w:rPr>
-              <w:pStyle w:val="Normal"/>
-              <w:widowControl w:val="1"/>
-              <w:keepLines/>
+              <w:pStyle w:val="Normal"/>
+              <w:keepNext w:val="1"/>
+              <w:keepLines/>
+              <w:widowControl w:val="1"/>
               <w:snapToGrid w:val="0"/>
               <w:spacing w:before="0" w:after="60" w:line="300" w:lineRule="exact"/>
-              <w:keepNext w:val="1"/>
+              <w:rPr>
+                <w:rFonts w:ascii="Palatino Linotype" w:hAnsi="Palatino Linotype"/>
+                <w:i/>
+                <w:iCs/>
+                <w:color w:val="FF0000"/>
+              </w:rPr>
             </w:pPr>
             <w:r>
               <w:rPr>
@@ -916,23 +931,24 @@
           </w:p>
           <w:p>
             <w:pPr>
-              <w:rPr>
-                <w:rFonts w:ascii="Palatino Linotype" w:hAnsi="Palatino Linotype"/>
-                <w:i/>
-                <w:iCs/>
-                <w:color w:val="FF0000"/>
-              </w:rPr>
-              <w:pStyle w:val="Normal"/>
-              <w:keepLines/>
+              <w:pStyle w:val="Normal"/>
+              <w:keepLines/>
+              <w:widowControl w:val="1"/>
+              <w:wordWrap w:val="0"/>
               <w:snapToGrid w:val="0"/>
               <w:spacing w:before="0" w:after="100" w:line="300" w:lineRule="exact"/>
-              <w:widowControl w:val="1"/>
+              <w:rPr>
+                <w:rFonts w:ascii="Palatino Linotype" w:hAnsi="Palatino Linotype"/>
+                <w:i/>
+                <w:iCs/>
+                <w:color w:val="FF0000"/>
+              </w:rPr>
             </w:pPr>
             <w:r>
               <w:rPr>
                 <w:color w:val="000000"/>
                 <w:rFonts w:ascii="Palatino Linotype" w:hAnsi="Palatino Linotype" w:eastAsia="SimSun" w:cs="Palatino Linotype"/>
-                <w:lang w:val="zh-CN" w:eastAsia="zh-CN"/>
+                <w:lang w:val="en-US" w:eastAsia="zh-CN"/>
                 <w:sz w:val="23"/>
                 <w:szCs w:val="23"/>
               </w:rPr>
@@ -946,18 +962,18 @@
           </w:tcPr>
           <w:p>
             <w:pPr>
-              <w:rPr>
-                <w:rFonts w:ascii="Palatino Linotype" w:hAnsi="Palatino Linotype"/>
-                <w:i/>
-                <w:iCs/>
-                <w:color w:val="FF0000"/>
-              </w:rPr>
-              <w:pStyle w:val="Normal"/>
-              <w:widowControl w:val="1"/>
-              <w:keepLines/>
+              <w:pStyle w:val="Normal"/>
+              <w:keepNext w:val="1"/>
+              <w:keepLines/>
+              <w:widowControl w:val="1"/>
               <w:snapToGrid w:val="0"/>
               <w:spacing w:before="0" w:after="60" w:line="300" w:lineRule="exact"/>
-              <w:keepNext w:val="1"/>
+              <w:rPr>
+                <w:rFonts w:ascii="Palatino Linotype" w:hAnsi="Palatino Linotype"/>
+                <w:i/>
+                <w:iCs/>
+                <w:color w:val="FF0000"/>
+              </w:rPr>
             </w:pPr>
             <w:r>
               <w:rPr>
@@ -971,23 +987,24 @@
           </w:p>
           <w:p>
             <w:pPr>
-              <w:rPr>
-                <w:rFonts w:ascii="Palatino Linotype" w:hAnsi="Palatino Linotype"/>
-                <w:i/>
-                <w:iCs/>
-                <w:color w:val="FF0000"/>
-              </w:rPr>
-              <w:pStyle w:val="Normal"/>
-              <w:keepLines/>
+              <w:pStyle w:val="Normal"/>
+              <w:keepLines/>
+              <w:widowControl w:val="1"/>
+              <w:wordWrap w:val="0"/>
               <w:snapToGrid w:val="0"/>
               <w:spacing w:before="0" w:after="100" w:line="300" w:lineRule="exact"/>
-              <w:widowControl w:val="1"/>
+              <w:rPr>
+                <w:rFonts w:ascii="Palatino Linotype" w:hAnsi="Palatino Linotype"/>
+                <w:i/>
+                <w:iCs/>
+                <w:color w:val="FF0000"/>
+              </w:rPr>
             </w:pPr>
             <w:r>
               <w:rPr>
                 <w:color w:val="000000"/>
                 <w:rFonts w:ascii="Palatino Linotype" w:hAnsi="Palatino Linotype" w:eastAsia="SimSun" w:cs="Palatino Linotype"/>
-                <w:lang w:val="zh-CN" w:eastAsia="zh-CN"/>
+                <w:lang w:val="en-US" w:eastAsia="zh-CN"/>
                 <w:sz w:val="23"/>
                 <w:szCs w:val="23"/>
               </w:rPr>
@@ -1001,18 +1018,18 @@
           </w:tcPr>
           <w:p>
             <w:pPr>
-              <w:rPr>
-                <w:rFonts w:ascii="Palatino Linotype" w:hAnsi="Palatino Linotype"/>
-                <w:i/>
-                <w:iCs/>
-                <w:color w:val="FF0000"/>
-              </w:rPr>
-              <w:pStyle w:val="Normal"/>
-              <w:widowControl w:val="1"/>
-              <w:keepLines/>
+              <w:pStyle w:val="Normal"/>
+              <w:keepNext w:val="1"/>
+              <w:keepLines/>
+              <w:widowControl w:val="1"/>
               <w:snapToGrid w:val="0"/>
               <w:spacing w:before="0" w:after="60" w:line="300" w:lineRule="exact"/>
-              <w:keepNext w:val="1"/>
+              <w:rPr>
+                <w:rFonts w:ascii="Palatino Linotype" w:hAnsi="Palatino Linotype"/>
+                <w:i/>
+                <w:iCs/>
+                <w:color w:val="FF0000"/>
+              </w:rPr>
             </w:pPr>
             <w:r>
               <w:rPr>
@@ -1026,23 +1043,24 @@
           </w:p>
           <w:p>
             <w:pPr>
-              <w:rPr>
-                <w:rFonts w:ascii="Palatino Linotype" w:hAnsi="Palatino Linotype"/>
-                <w:i/>
-                <w:iCs/>
-                <w:color w:val="FF0000"/>
-              </w:rPr>
-              <w:pStyle w:val="Normal"/>
-              <w:keepLines/>
+              <w:pStyle w:val="Normal"/>
+              <w:keepLines/>
+              <w:widowControl w:val="1"/>
+              <w:wordWrap w:val="0"/>
               <w:snapToGrid w:val="0"/>
               <w:spacing w:before="0" w:after="100" w:line="300" w:lineRule="exact"/>
-              <w:widowControl w:val="1"/>
+              <w:rPr>
+                <w:rFonts w:ascii="Palatino Linotype" w:hAnsi="Palatino Linotype"/>
+                <w:i/>
+                <w:iCs/>
+                <w:color w:val="FF0000"/>
+              </w:rPr>
             </w:pPr>
             <w:r>
               <w:rPr>
                 <w:color w:val="FF0000"/>
                 <w:rFonts w:ascii="Palatino Linotype" w:hAnsi="Palatino Linotype" w:eastAsia="SimSun" w:cs="Palatino Linotype"/>
-                <w:lang w:val="zh-CN" w:eastAsia="zh-CN"/>
+                <w:lang w:val="en-US" w:eastAsia="zh-CN"/>
                 <w:sz w:val="23"/>
                 <w:szCs w:val="23"/>
               </w:rPr>
@@ -1061,18 +1079,18 @@
           </w:tcPr>
           <w:p>
             <w:pPr>
-              <w:rPr>
-                <w:rFonts w:ascii="Palatino Linotype" w:hAnsi="Palatino Linotype"/>
-                <w:i/>
-                <w:iCs/>
-                <w:color w:val="FF0000"/>
-              </w:rPr>
-              <w:pStyle w:val="Normal"/>
-              <w:widowControl w:val="1"/>
-              <w:keepLines/>
+              <w:pStyle w:val="Normal"/>
+              <w:keepNext w:val="1"/>
+              <w:keepLines/>
+              <w:widowControl w:val="1"/>
               <w:snapToGrid w:val="0"/>
               <w:spacing w:before="0" w:after="60" w:line="300" w:lineRule="exact"/>
-              <w:keepNext w:val="1"/>
+              <w:rPr>
+                <w:rFonts w:ascii="Palatino Linotype" w:hAnsi="Palatino Linotype"/>
+                <w:i/>
+                <w:iCs/>
+                <w:color w:val="FF0000"/>
+              </w:rPr>
             </w:pPr>
             <w:r>
               <w:rPr>
@@ -1086,23 +1104,24 @@
           </w:p>
           <w:p>
             <w:pPr>
-              <w:rPr>
-                <w:rFonts w:ascii="Palatino Linotype" w:hAnsi="Palatino Linotype"/>
-                <w:i/>
-                <w:iCs/>
-                <w:color w:val="FF0000"/>
-              </w:rPr>
-              <w:pStyle w:val="Normal"/>
-              <w:keepLines/>
+              <w:pStyle w:val="Normal"/>
+              <w:keepLines/>
+              <w:widowControl w:val="1"/>
+              <w:wordWrap w:val="0"/>
               <w:snapToGrid w:val="0"/>
               <w:spacing w:before="0" w:after="100" w:line="300" w:lineRule="exact"/>
-              <w:widowControl w:val="1"/>
+              <w:rPr>
+                <w:rFonts w:ascii="Palatino Linotype" w:hAnsi="Palatino Linotype"/>
+                <w:i/>
+                <w:iCs/>
+                <w:color w:val="FF0000"/>
+              </w:rPr>
             </w:pPr>
             <w:r>
               <w:rPr>
                 <w:color w:val="000000"/>
                 <w:rFonts w:ascii="Palatino Linotype" w:hAnsi="Palatino Linotype" w:eastAsia="SimSun" w:cs="Palatino Linotype"/>
-                <w:lang w:val="zh-CN" w:eastAsia="zh-CN"/>
+                <w:lang w:val="en-US" w:eastAsia="zh-CN"/>
                 <w:sz w:val="23"/>
                 <w:szCs w:val="23"/>
               </w:rPr>
@@ -1116,18 +1135,18 @@
           </w:tcPr>
           <w:p>
             <w:pPr>
-              <w:rPr>
-                <w:rFonts w:ascii="Palatino Linotype" w:hAnsi="Palatino Linotype"/>
-                <w:i/>
-                <w:iCs/>
-                <w:color w:val="FF0000"/>
-              </w:rPr>
-              <w:pStyle w:val="Normal"/>
-              <w:widowControl w:val="1"/>
-              <w:keepLines/>
+              <w:pStyle w:val="Normal"/>
+              <w:keepNext w:val="1"/>
+              <w:keepLines/>
+              <w:widowControl w:val="1"/>
               <w:snapToGrid w:val="0"/>
               <w:spacing w:before="0" w:after="60" w:line="300" w:lineRule="exact"/>
-              <w:keepNext w:val="1"/>
+              <w:rPr>
+                <w:rFonts w:ascii="Palatino Linotype" w:hAnsi="Palatino Linotype"/>
+                <w:i/>
+                <w:iCs/>
+                <w:color w:val="FF0000"/>
+              </w:rPr>
             </w:pPr>
             <w:r>
               <w:rPr>
@@ -1141,23 +1160,24 @@
           </w:p>
           <w:p>
             <w:pPr>
-              <w:rPr>
-                <w:rFonts w:ascii="Palatino Linotype" w:hAnsi="Palatino Linotype"/>
-                <w:i/>
-                <w:iCs/>
-                <w:color w:val="FF0000"/>
-              </w:rPr>
-              <w:pStyle w:val="Normal"/>
-              <w:keepLines/>
+              <w:pStyle w:val="Normal"/>
+              <w:keepLines/>
+              <w:widowControl w:val="1"/>
+              <w:wordWrap w:val="0"/>
               <w:snapToGrid w:val="0"/>
               <w:spacing w:before="0" w:after="100" w:line="300" w:lineRule="exact"/>
-              <w:widowControl w:val="1"/>
+              <w:rPr>
+                <w:rFonts w:ascii="Palatino Linotype" w:hAnsi="Palatino Linotype"/>
+                <w:i/>
+                <w:iCs/>
+                <w:color w:val="FF0000"/>
+              </w:rPr>
             </w:pPr>
             <w:r>
               <w:rPr>
                 <w:color w:val="000000"/>
                 <w:rFonts w:ascii="Palatino Linotype" w:hAnsi="Palatino Linotype" w:eastAsia="SimSun" w:cs="Palatino Linotype"/>
-                <w:lang w:val="zh-CN" w:eastAsia="zh-CN"/>
+                <w:lang w:val="en-US" w:eastAsia="zh-CN"/>
                 <w:sz w:val="23"/>
                 <w:szCs w:val="23"/>
               </w:rPr>
@@ -1171,18 +1191,18 @@
           </w:tcPr>
           <w:p>
             <w:pPr>
-              <w:rPr>
-                <w:rFonts w:ascii="Palatino Linotype" w:hAnsi="Palatino Linotype"/>
-                <w:i/>
-                <w:iCs/>
-                <w:color w:val="FF0000"/>
-              </w:rPr>
-              <w:pStyle w:val="Normal"/>
-              <w:widowControl w:val="1"/>
-              <w:keepLines/>
+              <w:pStyle w:val="Normal"/>
+              <w:keepNext w:val="1"/>
+              <w:keepLines/>
+              <w:widowControl w:val="1"/>
               <w:snapToGrid w:val="0"/>
               <w:spacing w:before="0" w:after="60" w:line="300" w:lineRule="exact"/>
-              <w:keepNext w:val="1"/>
+              <w:rPr>
+                <w:rFonts w:ascii="Palatino Linotype" w:hAnsi="Palatino Linotype"/>
+                <w:i/>
+                <w:iCs/>
+                <w:color w:val="FF0000"/>
+              </w:rPr>
             </w:pPr>
             <w:r>
               <w:rPr>
@@ -1196,23 +1216,24 @@
           </w:p>
           <w:p>
             <w:pPr>
-              <w:rPr>
-                <w:rFonts w:ascii="Palatino Linotype" w:hAnsi="Palatino Linotype"/>
-                <w:i/>
-                <w:iCs/>
-                <w:color w:val="FF0000"/>
-              </w:rPr>
-              <w:pStyle w:val="Normal"/>
-              <w:keepLines/>
+              <w:pStyle w:val="Normal"/>
+              <w:keepLines/>
+              <w:widowControl w:val="1"/>
+              <w:wordWrap w:val="0"/>
               <w:snapToGrid w:val="0"/>
               <w:spacing w:before="0" w:after="100" w:line="300" w:lineRule="exact"/>
-              <w:widowControl w:val="1"/>
+              <w:rPr>
+                <w:rFonts w:ascii="Palatino Linotype" w:hAnsi="Palatino Linotype"/>
+                <w:i/>
+                <w:iCs/>
+                <w:color w:val="FF0000"/>
+              </w:rPr>
             </w:pPr>
             <w:r>
               <w:rPr>
                 <w:color w:val="FF0000"/>
                 <w:rFonts w:ascii="Palatino Linotype" w:hAnsi="Palatino Linotype" w:eastAsia="SimSun" w:cs="Palatino Linotype"/>
-                <w:lang w:val="zh-CN" w:eastAsia="zh-CN"/>
+                <w:lang w:val="en-US" w:eastAsia="zh-CN"/>
                 <w:sz w:val="23"/>
                 <w:szCs w:val="23"/>
               </w:rPr>
@@ -1232,18 +1253,18 @@
           </w:tcPr>
           <w:p>
             <w:pPr>
-              <w:rPr>
-                <w:rFonts w:ascii="Palatino Linotype" w:hAnsi="Palatino Linotype"/>
-                <w:i/>
-                <w:iCs/>
-                <w:color w:val="FF0000"/>
-              </w:rPr>
-              <w:pStyle w:val="Normal"/>
-              <w:widowControl w:val="1"/>
-              <w:keepLines/>
+              <w:pStyle w:val="Normal"/>
+              <w:keepNext w:val="1"/>
+              <w:keepLines/>
+              <w:widowControl w:val="1"/>
               <w:snapToGrid w:val="0"/>
               <w:spacing w:before="0" w:after="60" w:line="300" w:lineRule="exact"/>
-              <w:keepNext w:val="1"/>
+              <w:rPr>
+                <w:rFonts w:ascii="Palatino Linotype" w:hAnsi="Palatino Linotype"/>
+                <w:i/>
+                <w:iCs/>
+                <w:color w:val="FF0000"/>
+              </w:rPr>
             </w:pPr>
             <w:r>
               <w:rPr>
@@ -1258,25 +1279,26 @@
           </w:p>
           <w:p>
             <w:pPr>
-              <w:rPr>
-                <w:rFonts w:ascii="Palatino Linotype" w:hAnsi="Palatino Linotype"/>
-                <w:i/>
-                <w:iCs/>
-                <w:color w:val="FF0000"/>
-              </w:rPr>
               <w:pStyle w:val="Normal"/>
               <w:keepNext/>
               <w:keepLines/>
+              <w:widowControl w:val="1"/>
+              <w:wordWrap w:val="0"/>
               <w:snapToGrid w:val="0"/>
               <w:spacing w:before="0" w:after="100" w:line="300" w:lineRule="exact"/>
-              <w:widowControl w:val="1"/>
+              <w:rPr>
+                <w:rFonts w:ascii="Palatino Linotype" w:hAnsi="Palatino Linotype"/>
+                <w:i/>
+                <w:iCs/>
+                <w:color w:val="FF0000"/>
+              </w:rPr>
             </w:pPr>
             <w:r>
               <w:rPr>
                 <w:color w:val="000000"/>
                 <w:b/>
                 <w:rFonts w:ascii="Palatino Linotype" w:hAnsi="Palatino Linotype" w:eastAsia="SimSun" w:cs="Palatino Linotype"/>
-                <w:lang w:val="zh-CN" w:eastAsia="zh-CN"/>
+                <w:lang w:val="en-US" w:eastAsia="zh-CN"/>
                 <w:sz w:val="23"/>
                 <w:szCs w:val="23"/>
               </w:rPr>
@@ -1296,18 +1318,18 @@
           </w:tcPr>
           <w:p>
             <w:pPr>
-              <w:rPr>
-                <w:rFonts w:ascii="Palatino Linotype" w:hAnsi="Palatino Linotype"/>
-                <w:i/>
-                <w:iCs/>
-                <w:color w:val="FF0000"/>
-              </w:rPr>
-              <w:pStyle w:val="Normal"/>
-              <w:widowControl w:val="1"/>
-              <w:keepLines/>
+              <w:pStyle w:val="Normal"/>
+              <w:keepNext w:val="1"/>
+              <w:keepLines/>
+              <w:widowControl w:val="1"/>
               <w:snapToGrid w:val="0"/>
               <w:spacing w:before="0" w:after="60" w:line="300" w:lineRule="exact"/>
-              <w:keepNext w:val="1"/>
+              <w:rPr>
+                <w:rFonts w:ascii="Palatino Linotype" w:hAnsi="Palatino Linotype"/>
+                <w:i/>
+                <w:iCs/>
+                <w:color w:val="FF0000"/>
+              </w:rPr>
             </w:pPr>
             <w:r>
               <w:rPr>
@@ -1321,24 +1343,25 @@
           </w:p>
           <w:p>
             <w:pPr>
-              <w:rPr>
-                <w:rFonts w:ascii="Palatino Linotype" w:hAnsi="Palatino Linotype"/>
-                <w:i/>
-                <w:iCs/>
-                <w:color w:val="FF0000"/>
-              </w:rPr>
               <w:pStyle w:val="Normal"/>
               <w:keepNext/>
               <w:keepLines/>
+              <w:widowControl w:val="1"/>
+              <w:wordWrap w:val="0"/>
               <w:snapToGrid w:val="0"/>
               <w:spacing w:before="0" w:after="100" w:line="300" w:lineRule="exact"/>
-              <w:widowControl w:val="1"/>
+              <w:rPr>
+                <w:rFonts w:ascii="Palatino Linotype" w:hAnsi="Palatino Linotype"/>
+                <w:i/>
+                <w:iCs/>
+                <w:color w:val="FF0000"/>
+              </w:rPr>
             </w:pPr>
             <w:r>
               <w:rPr>
                 <w:color w:val="000000"/>
                 <w:rFonts w:ascii="Palatino Linotype" w:hAnsi="Palatino Linotype" w:eastAsia="SimSun" w:cs="Palatino Linotype"/>
-                <w:lang w:val="zh-CN" w:eastAsia="zh-CN"/>
+                <w:lang w:val="en-US" w:eastAsia="zh-CN"/>
                 <w:sz w:val="23"/>
                 <w:szCs w:val="23"/>
               </w:rPr>
@@ -1358,18 +1381,18 @@
           </w:tcPr>
           <w:p>
             <w:pPr>
-              <w:rPr>
-                <w:rFonts w:ascii="Palatino Linotype" w:hAnsi="Palatino Linotype"/>
-                <w:i/>
-                <w:iCs/>
-                <w:color w:val="FF0000"/>
-              </w:rPr>
-              <w:pStyle w:val="Normal"/>
-              <w:widowControl w:val="1"/>
-              <w:keepLines/>
+              <w:pStyle w:val="Normal"/>
+              <w:keepNext w:val="1"/>
+              <w:keepLines/>
+              <w:widowControl w:val="1"/>
               <w:snapToGrid w:val="0"/>
               <w:spacing w:before="0" w:after="60" w:line="300" w:lineRule="exact"/>
-              <w:keepNext w:val="1"/>
+              <w:rPr>
+                <w:rFonts w:ascii="Palatino Linotype" w:hAnsi="Palatino Linotype"/>
+                <w:i/>
+                <w:iCs/>
+                <w:color w:val="FF0000"/>
+              </w:rPr>
             </w:pPr>
             <w:r>
               <w:rPr>
@@ -1383,23 +1406,24 @@
           </w:p>
           <w:p>
             <w:pPr>
-              <w:rPr>
-                <w:rFonts w:ascii="Palatino Linotype" w:hAnsi="Palatino Linotype"/>
-                <w:i/>
-                <w:iCs/>
-                <w:color w:val="FF0000"/>
-              </w:rPr>
-              <w:pStyle w:val="Normal"/>
-              <w:keepLines/>
+              <w:pStyle w:val="Normal"/>
+              <w:keepLines/>
+              <w:widowControl w:val="1"/>
+              <w:wordWrap w:val="0"/>
               <w:snapToGrid w:val="0"/>
               <w:spacing w:before="0" w:after="100" w:line="300" w:lineRule="exact"/>
-              <w:widowControl w:val="1"/>
+              <w:rPr>
+                <w:rFonts w:ascii="Palatino Linotype" w:hAnsi="Palatino Linotype"/>
+                <w:i/>
+                <w:iCs/>
+                <w:color w:val="FF0000"/>
+              </w:rPr>
             </w:pPr>
             <w:r>
               <w:rPr>
                 <w:color w:val="FF0000"/>
                 <w:rFonts w:ascii="Palatino Linotype" w:hAnsi="Palatino Linotype" w:eastAsia="SimSun" w:cs="Palatino Linotype"/>
-                <w:lang w:val="zh-CN" w:eastAsia="zh-CN"/>
+                <w:lang w:val="en-US" w:eastAsia="zh-CN"/>
                 <w:sz w:val="23"/>
                 <w:szCs w:val="23"/>
               </w:rPr>
@@ -1419,52 +1443,53 @@
           </w:tcPr>
           <w:p>
             <w:pPr>
-              <w:rPr>
-                <w:rFonts w:ascii="Palatino Linotype" w:hAnsi="Palatino Linotype"/>
-                <w:i/>
-                <w:iCs/>
-                <w:color w:val="FF0000"/>
-              </w:rPr>
-              <w:pStyle w:val="Normal"/>
-              <w:widowControl w:val="1"/>
-              <w:keepLines/>
+              <w:pStyle w:val="Normal"/>
+              <w:keepNext w:val="1"/>
+              <w:keepLines/>
+              <w:widowControl w:val="1"/>
               <w:snapToGrid w:val="0"/>
               <w:spacing w:before="0" w:after="60" w:line="300" w:lineRule="exact"/>
-              <w:keepNext w:val="1"/>
-            </w:pPr>
-            <w:r>
-              <w:rPr>
-                <w:rFonts w:ascii="Palatino Linotype" w:hAnsi="Palatino Linotype"/>
-                <w:color w:val="FF0000"/>
-                <w:sz w:val="23"/>
-                <w:szCs w:val="23"/>
-              </w:rPr>
-              <w:t xml:space="preserve">OAL is applied to 39 full-text mechanism studies through 89 scoped claim records. Section 2 distinguishes the 19 domain-focused studies, 20 transferable mechanisms and the 123-reference bibliography. Table 2 identifies the study groups; Figure 3 retains the original framework schematic beside the populated heatmap. Section 5.3 and Table 5 compare what AIS protection, observation corroboration, attestation, trust-aware routing and consensus actually support, and specify the evidence required at the next handover. Section 5.4 and Table 6 report domain stratification, exclusions and coding sensitivity, with all 39 leave-one-out results released. The supplements provide study versions, retrieval links, claim locators, reference roles and coding decisions. Four of the 14 previously uncoded original candidates were recovered; ten remain incompletely accessible. Zero cells describe this sample, while the physical UAV-node experiment is identified as a bounded positive precedent.</w:t>
-            </w:r>
-          </w:p>
-          <w:p>
-            <w:pPr>
-              <w:rPr>
-                <w:rFonts w:ascii="Palatino Linotype" w:hAnsi="Palatino Linotype"/>
-                <w:i/>
-                <w:iCs/>
-                <w:color w:val="FF0000"/>
-              </w:rPr>
-              <w:pStyle w:val="Normal"/>
-              <w:keepLines/>
+              <w:rPr>
+                <w:rFonts w:ascii="Palatino Linotype" w:hAnsi="Palatino Linotype"/>
+                <w:i/>
+                <w:iCs/>
+                <w:color w:val="FF0000"/>
+              </w:rPr>
+            </w:pPr>
+            <w:r>
+              <w:rPr>
+                <w:rFonts w:ascii="Palatino Linotype" w:hAnsi="Palatino Linotype"/>
+                <w:color w:val="FF0000"/>
+                <w:sz w:val="23"/>
+                <w:szCs w:val="23"/>
+              </w:rPr>
+              <w:t xml:space="preserve">OAL is applied to 39 full-text mechanism studies through 89 scoped claim records. Section 2 distinguishes the 19 domain-focused studies, 20 transferable mechanisms and the 123-reference bibliography. Table 2 identifies the study groups and their sources; Figure 3 presents the framework schematic beside the populated heatmap. Section 5.3 and Table 5 compare what AIS protection, observation corroboration, attestation, trust-aware routing and consensus support, and specify the evidence required at the next handover. Section 5.4 and Table 6 report domain stratification, study-exclusion and coding sensitivity, and the results of removing each of the 39 studies in turn. Zero cells denote no coded claim in this sample. The physical UAV-node experiment is identified as evidence of cooperation and path adaptation under its stated operating conditions.</w:t>
+            </w:r>
+          </w:p>
+          <w:p>
+            <w:pPr>
+              <w:pStyle w:val="Normal"/>
+              <w:keepLines/>
+              <w:widowControl w:val="1"/>
+              <w:wordWrap w:val="0"/>
               <w:snapToGrid w:val="0"/>
               <w:spacing w:before="0" w:after="100" w:line="300" w:lineRule="exact"/>
-              <w:widowControl w:val="1"/>
+              <w:rPr>
+                <w:rFonts w:ascii="Palatino Linotype" w:hAnsi="Palatino Linotype"/>
+                <w:i/>
+                <w:iCs/>
+                <w:color w:val="FF0000"/>
+              </w:rPr>
             </w:pPr>
             <w:r>
               <w:rPr>
                 <w:color w:val="FF0000"/>
                 <w:rFonts w:ascii="Palatino Linotype" w:hAnsi="Palatino Linotype" w:eastAsia="SimSun" w:cs="Palatino Linotype"/>
-                <w:lang w:val="zh-CN" w:eastAsia="zh-CN"/>
-                <w:sz w:val="23"/>
-                <w:szCs w:val="23"/>
-              </w:rPr>
-              <w:t xml:space="preserve">我们通过 89 条限定范围的机制主张记录，将 OAL 应用于 39 篇经全文核查的机制研究。第 2 节区分了 19 篇面向具体应用领域的研究、20 篇提供可迁移机制的研究，以及包含 123 条文献的参考文献表。表 2 列出了各研究组；图 3 在原框架示意图旁保留了填入数据的热图。第 5.3 节和表 5 比较了 AIS 保护、观测佐证、远程证明、信任感知路由及共识机制实际能够支持的内容，并明确下一次交接所需的证据。第 5.4 节和表 6 报告了领域分层、排除研究及编码选择的敏感性分析，并提供了对全部 39 篇研究逐一删除后的结果。补充材料列出了研究版本、获取链接、主张在原文中的定位、参考文献的作用及编码决策。原来 14 篇未编码候选文献中，有 4 篇已获取，另外 10 篇仍无法完整访问。零值单元格描述的是本样本的情况；同时，实物 UAV 节点实验被明确列为具有特定适用范围的正面先例。</w:t>
+                <w:lang w:val="en-US" w:eastAsia="zh-CN"/>
+                <w:sz w:val="23"/>
+                <w:szCs w:val="23"/>
+              </w:rPr>
+              <w:t xml:space="preserve">我们通过 89 条限定范围的机制主张记录，将 OAL 应用于 39 篇经全文核查的机制研究。第 2 节区分了 19 篇面向具体应用领域的研究、20 篇提供可迁移机制的研究，以及包含 123 条文献的参考文献表。表 2 列出了各研究组及其文献来源；图 3 将框架示意图与填入数据的热图并列呈现。第 5.3 节和表 5 比较了 AIS 保护、观测佐证、远程证明、信任感知路由及共识机制所支持的内容，并明确下一次交接所需的证据。第 5.4 节和表 6 报告了领域分层、研究排除和编码选择的敏感性分析，以及依次删除 39 篇研究中每一篇后的结果。零值单元格表示本样本中没有相应的编码主张。实物 UAV 节点实验被列为在其所述运行条件下支持协作和路径自适应的证据。</w:t>
             </w:r>
           </w:p>
         </w:tc>
@@ -1480,52 +1505,53 @@
           </w:tcPr>
           <w:p>
             <w:pPr>
-              <w:rPr>
-                <w:rFonts w:ascii="Palatino Linotype" w:hAnsi="Palatino Linotype"/>
-                <w:i/>
-                <w:iCs/>
-                <w:color w:val="FF0000"/>
-              </w:rPr>
-              <w:pStyle w:val="Normal"/>
-              <w:widowControl w:val="1"/>
-              <w:keepLines/>
+              <w:pStyle w:val="Normal"/>
+              <w:keepNext w:val="1"/>
+              <w:keepLines/>
+              <w:widowControl w:val="1"/>
               <w:snapToGrid w:val="0"/>
               <w:spacing w:before="0" w:after="60" w:line="300" w:lineRule="exact"/>
-              <w:keepNext w:val="1"/>
-            </w:pPr>
-            <w:r>
-              <w:rPr>
-                <w:rFonts w:ascii="Palatino Linotype" w:hAnsi="Palatino Linotype"/>
-                <w:color w:val="FF0000"/>
-                <w:sz w:val="23"/>
-                <w:szCs w:val="23"/>
-              </w:rPr>
-              <w:t xml:space="preserve">Section 6.4 replaces the previous freshness/lineage example with a coalition mission that loses its gateway connection, commits a shore-side key revocation, and reconciles records after reconnection. Event intervals before, overlapping and after the effective revocation time lead to historical eligibility, quarantine and rejection, respectively. The example distinguishes locally available delegation from global authority learned later. Table 8 compares these outcomes with a mean-score policy and a veto-aware scalar policy using the same features.</w:t>
-            </w:r>
-          </w:p>
-          <w:p>
-            <w:pPr>
-              <w:rPr>
-                <w:rFonts w:ascii="Palatino Linotype" w:hAnsi="Palatino Linotype"/>
-                <w:i/>
-                <w:iCs/>
-                <w:color w:val="FF0000"/>
-              </w:rPr>
-              <w:pStyle w:val="Normal"/>
-              <w:keepLines/>
+              <w:rPr>
+                <w:rFonts w:ascii="Palatino Linotype" w:hAnsi="Palatino Linotype"/>
+                <w:i/>
+                <w:iCs/>
+                <w:color w:val="FF0000"/>
+              </w:rPr>
+            </w:pPr>
+            <w:r>
+              <w:rPr>
+                <w:rFonts w:ascii="Palatino Linotype" w:hAnsi="Palatino Linotype"/>
+                <w:color w:val="FF0000"/>
+                <w:sz w:val="23"/>
+                <w:szCs w:val="23"/>
+              </w:rPr>
+              <w:t xml:space="preserve">Section 6.4 presents a coalition mission that loses its gateway connection, commits a shore-side key revocation, and reconciles records after reconnection. Event intervals before, overlapping and after the effective revocation time lead to historical eligibility, quarantine and rejection, respectively. The example distinguishes locally available delegation from global authority learned later. Table 8 compares these outcomes with a mean-score policy and a veto-aware scalar policy using the same features.</w:t>
+            </w:r>
+          </w:p>
+          <w:p>
+            <w:pPr>
+              <w:pStyle w:val="Normal"/>
+              <w:keepLines/>
+              <w:widowControl w:val="1"/>
+              <w:wordWrap w:val="0"/>
               <w:snapToGrid w:val="0"/>
               <w:spacing w:before="0" w:after="100" w:line="300" w:lineRule="exact"/>
-              <w:widowControl w:val="1"/>
+              <w:rPr>
+                <w:rFonts w:ascii="Palatino Linotype" w:hAnsi="Palatino Linotype"/>
+                <w:i/>
+                <w:iCs/>
+                <w:color w:val="FF0000"/>
+              </w:rPr>
             </w:pPr>
             <w:r>
               <w:rPr>
                 <w:color w:val="FF0000"/>
                 <w:rFonts w:ascii="Palatino Linotype" w:hAnsi="Palatino Linotype" w:eastAsia="SimSun" w:cs="Palatino Linotype"/>
-                <w:lang w:val="zh-CN" w:eastAsia="zh-CN"/>
-                <w:sz w:val="23"/>
-                <w:szCs w:val="23"/>
-              </w:rPr>
-              <w:t xml:space="preserve">第 6.4 节以一个联盟任务替换了原先的新鲜度／谱系示例：任务的网关连接中断，岸端提交密钥撤销，随后在重新连接后对记录进行协调处理。事件时间区间分别位于撤销生效时间之前、与之重叠及之后时，会分别得到可纳入历史审计、隔离待审和拒绝的结果。该案例区分了本地可用的委托授权与稍后获知的全局权限。表 8 使用相同的输入特征，将这些结果与均值评分策略和具有否决规则的标量策略进行比较。</w:t>
+                <w:lang w:val="en-US" w:eastAsia="zh-CN"/>
+                <w:sz w:val="23"/>
+                <w:szCs w:val="23"/>
+              </w:rPr>
+              <w:t xml:space="preserve">第 6.4 节给出一个联盟任务：网关连接中断，岸端提交密钥撤销，随后在重新连接后对记录进行协调处理。事件时间区间分别位于撤销生效时间之前、与之重叠及之后时，会分别得到可纳入历史审计、隔离待审和拒绝的结果。该案例区分了本地可用的委托授权与稍后获知的全局权限。表 8 使用相同的输入特征，将这些结果与均值评分策略和具有否决规则的标量策略进行比较。</w:t>
             </w:r>
           </w:p>
         </w:tc>
@@ -1541,52 +1567,53 @@
           </w:tcPr>
           <w:p>
             <w:pPr>
-              <w:rPr>
-                <w:rFonts w:ascii="Palatino Linotype" w:hAnsi="Palatino Linotype"/>
-                <w:i/>
-                <w:iCs/>
-                <w:color w:val="FF0000"/>
-              </w:rPr>
-              <w:pStyle w:val="Normal"/>
-              <w:widowControl w:val="1"/>
-              <w:keepLines/>
+              <w:pStyle w:val="Normal"/>
+              <w:keepNext w:val="1"/>
+              <w:keepLines/>
+              <w:widowControl w:val="1"/>
               <w:snapToGrid w:val="0"/>
               <w:spacing w:before="0" w:after="60" w:line="300" w:lineRule="exact"/>
-              <w:keepNext w:val="1"/>
-            </w:pPr>
-            <w:r>
-              <w:rPr>
-                <w:rFonts w:ascii="Palatino Linotype" w:hAnsi="Palatino Linotype"/>
-                <w:color w:val="FF0000"/>
-                <w:sz w:val="23"/>
-                <w:szCs w:val="23"/>
-              </w:rPr>
-              <w:t xml:space="preserve">Sections 7.2–7.4 specify the participating organizations, peer/orderer placement, joint endorsement policy, state keys, deterministic chaincode operations, receipt verification and communication budget. The supplied replay executes signature and Merkle checks, arrival-order and duplicate-delivery checks, and all coalition signer subsets. It also computes exact application-message sizes and an explicitly assumed partition/deadline sensitivity. This is reproducible analytical validation of the stated rules; it is not reported as a Fabric deployment, consensus benchmark or integrated sea trial.</w:t>
-            </w:r>
-          </w:p>
-          <w:p>
-            <w:pPr>
-              <w:rPr>
-                <w:rFonts w:ascii="Palatino Linotype" w:hAnsi="Palatino Linotype"/>
-                <w:i/>
-                <w:iCs/>
-                <w:color w:val="FF0000"/>
-              </w:rPr>
-              <w:pStyle w:val="Normal"/>
-              <w:keepLines/>
+              <w:rPr>
+                <w:rFonts w:ascii="Palatino Linotype" w:hAnsi="Palatino Linotype"/>
+                <w:i/>
+                <w:iCs/>
+                <w:color w:val="FF0000"/>
+              </w:rPr>
+            </w:pPr>
+            <w:r>
+              <w:rPr>
+                <w:rFonts w:ascii="Palatino Linotype" w:hAnsi="Palatino Linotype"/>
+                <w:color w:val="FF0000"/>
+                <w:sz w:val="23"/>
+                <w:szCs w:val="23"/>
+              </w:rPr>
+              <w:t xml:space="preserve">Sections 7.2–7.4 specify the participating organizations, peer/orderer placement, joint endorsement policy, state keys, deterministic chaincode operations, receipt verification and communication budget. We executed a synthetic replay that checks signatures, Merkle inclusion, arrival-order and duplicate-delivery handling, and all 16 coalition signer subsets. We also calculated application-message sizes from the stated encoding and examined partition/deadline sensitivity under declared delay assumptions. These analyses test the specified rules and payload requirements; they do not measure Fabric deployment, consensus or integrated sea-trial performance.</w:t>
+            </w:r>
+          </w:p>
+          <w:p>
+            <w:pPr>
+              <w:pStyle w:val="Normal"/>
+              <w:keepLines/>
+              <w:widowControl w:val="1"/>
+              <w:wordWrap w:val="0"/>
               <w:snapToGrid w:val="0"/>
               <w:spacing w:before="0" w:after="100" w:line="300" w:lineRule="exact"/>
-              <w:widowControl w:val="1"/>
+              <w:rPr>
+                <w:rFonts w:ascii="Palatino Linotype" w:hAnsi="Palatino Linotype"/>
+                <w:i/>
+                <w:iCs/>
+                <w:color w:val="FF0000"/>
+              </w:rPr>
             </w:pPr>
             <w:r>
               <w:rPr>
                 <w:color w:val="FF0000"/>
                 <w:rFonts w:ascii="Palatino Linotype" w:hAnsi="Palatino Linotype" w:eastAsia="SimSun" w:cs="Palatino Linotype"/>
-                <w:lang w:val="zh-CN" w:eastAsia="zh-CN"/>
-                <w:sz w:val="23"/>
-                <w:szCs w:val="23"/>
-              </w:rPr>
-              <w:t xml:space="preserve">第 7.2—7.4 节明确规定了参与组织、对等节点／排序节点的部署位置、联合背书策略、状态键、确定性链码操作、回执验证及通信预算。所提供的回放执行签名和 Merkle 检查、到达顺序和重复投递检查，并检查联盟签名者的全部子集。它还计算了精确的应用消息大小，以及在明确假设下分区时长与截止期的敏感性。这构成了对所述规则的可复现分析验证；文章没有将其报告为 Fabric 部署、共识性能基准或一体化海试。</w:t>
+                <w:lang w:val="en-US" w:eastAsia="zh-CN"/>
+                <w:sz w:val="23"/>
+                <w:szCs w:val="23"/>
+              </w:rPr>
+              <w:t xml:space="preserve">第 7.2—7.4 节明确了参与组织、对等节点和排序节点的部署位置、联合背书策略、状态键、确定性链码操作、回执验证及通信预算。我们执行了合成回放，检查签名、Merkle 包含证明、乱序与重复消息处理，以及联盟签署者的全部 16 种子集。我们还根据所述编码计算了应用消息大小，并在明确的时延假设下分析了分区时长与截止时间的敏感性。这些分析检验的是所规定的规则和载荷需求，不涉及对 Fabric 部署、共识或综合海试性能的测量。</w:t>
             </w:r>
           </w:p>
         </w:tc>
@@ -1602,52 +1629,53 @@
           </w:tcPr>
           <w:p>
             <w:pPr>
-              <w:rPr>
-                <w:rFonts w:ascii="Palatino Linotype" w:hAnsi="Palatino Linotype"/>
-                <w:i/>
-                <w:iCs/>
-                <w:color w:val="FF0000"/>
-              </w:rPr>
-              <w:pStyle w:val="Normal"/>
-              <w:widowControl w:val="1"/>
-              <w:keepLines/>
+              <w:pStyle w:val="Normal"/>
+              <w:keepNext w:val="1"/>
+              <w:keepLines/>
+              <w:widowControl w:val="1"/>
               <w:snapToGrid w:val="0"/>
               <w:spacing w:before="0" w:after="60" w:line="300" w:lineRule="exact"/>
-              <w:keepNext w:val="1"/>
-            </w:pPr>
-            <w:r>
-              <w:rPr>
-                <w:rFonts w:ascii="Palatino Linotype" w:hAnsi="Palatino Linotype"/>
-                <w:color w:val="FF0000"/>
-                <w:sz w:val="23"/>
-                <w:szCs w:val="23"/>
-              </w:rPr>
-              <w:t xml:space="preserve">We also sharpened the title’s intended blockchain scope in the abstract and Sections 7.1 and 11. The ledger contributes to jointly governed commitments, policy state and reconciliation. A policy-validating witnessed log produces the same decisions under matched rules; the revised text therefore confines ledger value to particular governance conditions and implementation requirements. These changes connect the blockchain-assisted framing to a concrete design without extending the evidence to untested mission performance.</w:t>
-            </w:r>
-          </w:p>
-          <w:p>
-            <w:pPr>
-              <w:rPr>
-                <w:rFonts w:ascii="Palatino Linotype" w:hAnsi="Palatino Linotype"/>
-                <w:i/>
-                <w:iCs/>
-                <w:color w:val="FF0000"/>
-              </w:rPr>
-              <w:pStyle w:val="Normal"/>
-              <w:keepLines/>
+              <w:rPr>
+                <w:rFonts w:ascii="Palatino Linotype" w:hAnsi="Palatino Linotype"/>
+                <w:i/>
+                <w:iCs/>
+                <w:color w:val="FF0000"/>
+              </w:rPr>
+            </w:pPr>
+            <w:r>
+              <w:rPr>
+                <w:rFonts w:ascii="Palatino Linotype" w:hAnsi="Palatino Linotype"/>
+                <w:color w:val="FF0000"/>
+                <w:sz w:val="23"/>
+                <w:szCs w:val="23"/>
+              </w:rPr>
+              <w:t xml:space="preserve">The abstract and Sections 7.1 and 11 state the ledger’s role in jointly governed commitments, policy state and reconciliation. A policy-validating witnessed log produces the same decisions under matched rules. Ledger value is therefore conditional on governance requirements and implementation cost. The coalition case connects this role to specific authorization rules and recovery operations.</w:t>
+            </w:r>
+          </w:p>
+          <w:p>
+            <w:pPr>
+              <w:pStyle w:val="Normal"/>
+              <w:keepLines/>
+              <w:widowControl w:val="1"/>
+              <w:wordWrap w:val="0"/>
               <w:snapToGrid w:val="0"/>
               <w:spacing w:before="0" w:after="100" w:line="300" w:lineRule="exact"/>
-              <w:widowControl w:val="1"/>
+              <w:rPr>
+                <w:rFonts w:ascii="Palatino Linotype" w:hAnsi="Palatino Linotype"/>
+                <w:i/>
+                <w:iCs/>
+                <w:color w:val="FF0000"/>
+              </w:rPr>
             </w:pPr>
             <w:r>
               <w:rPr>
                 <w:color w:val="FF0000"/>
                 <w:rFonts w:ascii="Palatino Linotype" w:hAnsi="Palatino Linotype" w:eastAsia="SimSun" w:cs="Palatino Linotype"/>
-                <w:lang w:val="zh-CN" w:eastAsia="zh-CN"/>
-                <w:sz w:val="23"/>
-                <w:szCs w:val="23"/>
-              </w:rPr>
-              <w:t xml:space="preserve">我们还在摘要及第 7.1、11 节中更明确地界定了标题中区块链的作用范围。账本用于共同治理的承诺、策略状态及协调恢复。在规则匹配时，具有策略校验能力的见证日志得到相同的决策；因此，修订稿将账本的价值限定于特定治理条件和实现要求。这些修改将“区块链辅助”的论述与具体设计联系起来，同时没有将证据扩展到尚未经测试的任务性能。</w:t>
+                <w:lang w:val="en-US" w:eastAsia="zh-CN"/>
+                <w:sz w:val="23"/>
+                <w:szCs w:val="23"/>
+              </w:rPr>
+              <w:t xml:space="preserve">摘要以及第 7.1 节和第 11 节说明了账本在共同治理的承诺记录、策略状态和协调恢复中的作用。在规则匹配的条件下，执行策略校验的见证日志会产生相同的决策。因此，账本的价值取决于治理需求和实现成本。联盟案例将这一作用落实到具体的授权规则和恢复操作中。</w:t>
             </w:r>
           </w:p>
         </w:tc>
@@ -1663,18 +1691,18 @@
           </w:tcPr>
           <w:p>
             <w:pPr>
-              <w:rPr>
-                <w:rFonts w:ascii="Palatino Linotype" w:hAnsi="Palatino Linotype"/>
-                <w:i/>
-                <w:iCs/>
-                <w:color w:val="FF0000"/>
-              </w:rPr>
-              <w:pStyle w:val="Normal"/>
-              <w:widowControl w:val="1"/>
-              <w:keepLines/>
+              <w:pStyle w:val="Normal"/>
+              <w:keepNext w:val="1"/>
+              <w:keepLines/>
+              <w:widowControl w:val="1"/>
               <w:snapToGrid w:val="0"/>
               <w:spacing w:before="0" w:after="60" w:line="300" w:lineRule="exact"/>
-              <w:keepNext w:val="1"/>
+              <w:rPr>
+                <w:rFonts w:ascii="Palatino Linotype" w:hAnsi="Palatino Linotype"/>
+                <w:i/>
+                <w:iCs/>
+                <w:color w:val="FF0000"/>
+              </w:rPr>
             </w:pPr>
             <w:r>
               <w:rPr>
@@ -1689,25 +1717,26 @@
           </w:p>
           <w:p>
             <w:pPr>
-              <w:rPr>
-                <w:rFonts w:ascii="Palatino Linotype" w:hAnsi="Palatino Linotype"/>
-                <w:i/>
-                <w:iCs/>
-                <w:color w:val="FF0000"/>
-              </w:rPr>
               <w:pStyle w:val="Normal"/>
               <w:keepNext/>
               <w:keepLines/>
+              <w:widowControl w:val="1"/>
+              <w:wordWrap w:val="0"/>
               <w:snapToGrid w:val="0"/>
               <w:spacing w:before="0" w:after="100" w:line="300" w:lineRule="exact"/>
-              <w:widowControl w:val="1"/>
+              <w:rPr>
+                <w:rFonts w:ascii="Palatino Linotype" w:hAnsi="Palatino Linotype"/>
+                <w:i/>
+                <w:iCs/>
+                <w:color w:val="FF0000"/>
+              </w:rPr>
             </w:pPr>
             <w:r>
               <w:rPr>
                 <w:color w:val="000000"/>
                 <w:b/>
                 <w:rFonts w:ascii="Palatino Linotype" w:hAnsi="Palatino Linotype" w:eastAsia="SimSun" w:cs="Palatino Linotype"/>
-                <w:lang w:val="zh-CN" w:eastAsia="zh-CN"/>
+                <w:lang w:val="en-US" w:eastAsia="zh-CN"/>
                 <w:sz w:val="23"/>
                 <w:szCs w:val="23"/>
               </w:rPr>
@@ -1727,18 +1756,18 @@
           </w:tcPr>
           <w:p>
             <w:pPr>
-              <w:rPr>
-                <w:rFonts w:ascii="Palatino Linotype" w:hAnsi="Palatino Linotype"/>
-                <w:i/>
-                <w:iCs/>
-                <w:color w:val="FF0000"/>
-              </w:rPr>
-              <w:pStyle w:val="Normal"/>
-              <w:widowControl w:val="1"/>
-              <w:keepLines/>
+              <w:pStyle w:val="Normal"/>
+              <w:keepNext w:val="1"/>
+              <w:keepLines/>
+              <w:widowControl w:val="1"/>
               <w:snapToGrid w:val="0"/>
               <w:spacing w:before="0" w:after="60" w:line="300" w:lineRule="exact"/>
-              <w:keepNext w:val="1"/>
+              <w:rPr>
+                <w:rFonts w:ascii="Palatino Linotype" w:hAnsi="Palatino Linotype"/>
+                <w:i/>
+                <w:iCs/>
+                <w:color w:val="FF0000"/>
+              </w:rPr>
             </w:pPr>
             <w:r>
               <w:rPr>
@@ -1752,24 +1781,25 @@
           </w:p>
           <w:p>
             <w:pPr>
-              <w:rPr>
-                <w:rFonts w:ascii="Palatino Linotype" w:hAnsi="Palatino Linotype"/>
-                <w:i/>
-                <w:iCs/>
-                <w:color w:val="FF0000"/>
-              </w:rPr>
               <w:pStyle w:val="Normal"/>
               <w:keepNext/>
               <w:keepLines/>
+              <w:widowControl w:val="1"/>
+              <w:wordWrap w:val="0"/>
               <w:snapToGrid w:val="0"/>
               <w:spacing w:before="0" w:after="100" w:line="300" w:lineRule="exact"/>
-              <w:widowControl w:val="1"/>
+              <w:rPr>
+                <w:rFonts w:ascii="Palatino Linotype" w:hAnsi="Palatino Linotype"/>
+                <w:i/>
+                <w:iCs/>
+                <w:color w:val="FF0000"/>
+              </w:rPr>
             </w:pPr>
             <w:r>
               <w:rPr>
                 <w:color w:val="000000"/>
                 <w:rFonts w:ascii="Palatino Linotype" w:hAnsi="Palatino Linotype" w:eastAsia="SimSun" w:cs="Palatino Linotype"/>
-                <w:lang w:val="zh-CN" w:eastAsia="zh-CN"/>
+                <w:lang w:val="en-US" w:eastAsia="zh-CN"/>
                 <w:sz w:val="23"/>
                 <w:szCs w:val="23"/>
               </w:rPr>
@@ -1789,18 +1819,18 @@
           </w:tcPr>
           <w:p>
             <w:pPr>
-              <w:rPr>
-                <w:rFonts w:ascii="Palatino Linotype" w:hAnsi="Palatino Linotype"/>
-                <w:i/>
-                <w:iCs/>
-                <w:color w:val="FF0000"/>
-              </w:rPr>
-              <w:pStyle w:val="Normal"/>
-              <w:widowControl w:val="1"/>
-              <w:keepLines/>
+              <w:pStyle w:val="Normal"/>
+              <w:keepNext w:val="1"/>
+              <w:keepLines/>
+              <w:widowControl w:val="1"/>
               <w:snapToGrid w:val="0"/>
               <w:spacing w:before="0" w:after="60" w:line="300" w:lineRule="exact"/>
-              <w:keepNext w:val="1"/>
+              <w:rPr>
+                <w:rFonts w:ascii="Palatino Linotype" w:hAnsi="Palatino Linotype"/>
+                <w:i/>
+                <w:iCs/>
+                <w:color w:val="FF0000"/>
+              </w:rPr>
             </w:pPr>
             <w:r>
               <w:rPr>
@@ -1814,23 +1844,24 @@
           </w:p>
           <w:p>
             <w:pPr>
-              <w:rPr>
-                <w:rFonts w:ascii="Palatino Linotype" w:hAnsi="Palatino Linotype"/>
-                <w:i/>
-                <w:iCs/>
-                <w:color w:val="FF0000"/>
-              </w:rPr>
-              <w:pStyle w:val="Normal"/>
-              <w:keepLines/>
+              <w:pStyle w:val="Normal"/>
+              <w:keepLines/>
+              <w:widowControl w:val="1"/>
+              <w:wordWrap w:val="0"/>
               <w:snapToGrid w:val="0"/>
               <w:spacing w:before="0" w:after="100" w:line="300" w:lineRule="exact"/>
-              <w:widowControl w:val="1"/>
+              <w:rPr>
+                <w:rFonts w:ascii="Palatino Linotype" w:hAnsi="Palatino Linotype"/>
+                <w:i/>
+                <w:iCs/>
+                <w:color w:val="FF0000"/>
+              </w:rPr>
             </w:pPr>
             <w:r>
               <w:rPr>
                 <w:color w:val="FF0000"/>
                 <w:rFonts w:ascii="Palatino Linotype" w:hAnsi="Palatino Linotype" w:eastAsia="SimSun" w:cs="Palatino Linotype"/>
-                <w:lang w:val="zh-CN" w:eastAsia="zh-CN"/>
+                <w:lang w:val="en-US" w:eastAsia="zh-CN"/>
                 <w:sz w:val="23"/>
                 <w:szCs w:val="23"/>
               </w:rPr>
@@ -1850,18 +1881,18 @@
           </w:tcPr>
           <w:p>
             <w:pPr>
-              <w:rPr>
-                <w:rFonts w:ascii="Palatino Linotype" w:hAnsi="Palatino Linotype"/>
-                <w:i/>
-                <w:iCs/>
-                <w:color w:val="FF0000"/>
-              </w:rPr>
-              <w:pStyle w:val="Normal"/>
-              <w:widowControl w:val="1"/>
-              <w:keepLines/>
+              <w:pStyle w:val="Normal"/>
+              <w:keepNext w:val="1"/>
+              <w:keepLines/>
+              <w:widowControl w:val="1"/>
               <w:snapToGrid w:val="0"/>
               <w:spacing w:before="0" w:after="60" w:line="300" w:lineRule="exact"/>
-              <w:keepNext w:val="1"/>
+              <w:rPr>
+                <w:rFonts w:ascii="Palatino Linotype" w:hAnsi="Palatino Linotype"/>
+                <w:i/>
+                <w:iCs/>
+                <w:color w:val="FF0000"/>
+              </w:rPr>
             </w:pPr>
             <w:r>
               <w:rPr>
@@ -1876,25 +1907,26 @@
           </w:p>
           <w:p>
             <w:pPr>
-              <w:rPr>
-                <w:rFonts w:ascii="Palatino Linotype" w:hAnsi="Palatino Linotype"/>
-                <w:i/>
-                <w:iCs/>
-                <w:color w:val="FF0000"/>
-              </w:rPr>
               <w:pStyle w:val="Normal"/>
               <w:keepNext/>
               <w:keepLines/>
+              <w:widowControl w:val="1"/>
+              <w:wordWrap w:val="0"/>
               <w:snapToGrid w:val="0"/>
               <w:spacing w:before="0" w:after="100" w:line="300" w:lineRule="exact"/>
-              <w:widowControl w:val="1"/>
+              <w:rPr>
+                <w:rFonts w:ascii="Palatino Linotype" w:hAnsi="Palatino Linotype"/>
+                <w:i/>
+                <w:iCs/>
+                <w:color w:val="FF0000"/>
+              </w:rPr>
             </w:pPr>
             <w:r>
               <w:rPr>
                 <w:color w:val="000000"/>
                 <w:b/>
                 <w:rFonts w:ascii="Palatino Linotype" w:hAnsi="Palatino Linotype" w:eastAsia="SimSun" w:cs="Palatino Linotype"/>
-                <w:lang w:val="zh-CN" w:eastAsia="zh-CN"/>
+                <w:lang w:val="en-US" w:eastAsia="zh-CN"/>
                 <w:sz w:val="23"/>
                 <w:szCs w:val="23"/>
               </w:rPr>
@@ -1914,52 +1946,53 @@
           </w:tcPr>
           <w:p>
             <w:pPr>
-              <w:rPr>
-                <w:rFonts w:ascii="Palatino Linotype" w:hAnsi="Palatino Linotype"/>
-                <w:i/>
-                <w:iCs/>
-                <w:color w:val="FF0000"/>
-              </w:rPr>
-              <w:pStyle w:val="Normal"/>
-              <w:widowControl w:val="1"/>
-              <w:keepLines/>
+              <w:pStyle w:val="Normal"/>
+              <w:keepNext w:val="1"/>
+              <w:keepLines/>
+              <w:widowControl w:val="1"/>
               <w:snapToGrid w:val="0"/>
               <w:spacing w:before="0" w:after="60" w:line="300" w:lineRule="exact"/>
-              <w:keepNext w:val="1"/>
-            </w:pPr>
-            <w:r>
-              <w:rPr>
-                <w:rFonts w:ascii="Palatino Linotype" w:hAnsi="Palatino Linotype"/>
-                <w:color w:val="FF0000"/>
-                <w:sz w:val="23"/>
-                <w:szCs w:val="23"/>
-              </w:rPr>
-              <w:t xml:space="preserve">The revised manuscript and supplement distinguish completed analytical checks from proposed implementation and field evaluation. The manuscript remains anonymous.</w:t>
-            </w:r>
-          </w:p>
-          <w:p>
-            <w:pPr>
-              <w:rPr>
-                <w:rFonts w:ascii="Palatino Linotype" w:hAnsi="Palatino Linotype"/>
-                <w:i/>
-                <w:iCs/>
-                <w:color w:val="FF0000"/>
-              </w:rPr>
-              <w:pStyle w:val="Normal"/>
-              <w:keepLines/>
+              <w:rPr>
+                <w:rFonts w:ascii="Palatino Linotype" w:hAnsi="Palatino Linotype"/>
+                <w:i/>
+                <w:iCs/>
+                <w:color w:val="FF0000"/>
+              </w:rPr>
+            </w:pPr>
+            <w:r>
+              <w:rPr>
+                <w:rFonts w:ascii="Palatino Linotype" w:hAnsi="Palatino Linotype"/>
+                <w:color w:val="FF0000"/>
+                <w:sz w:val="23"/>
+                <w:szCs w:val="23"/>
+              </w:rPr>
+              <w:t xml:space="preserve">The analytical results concern literature coding, deterministic policy checks and application-byte calculations. Fabric deployment and integrated mission trials are proposed validation steps.</w:t>
+            </w:r>
+          </w:p>
+          <w:p>
+            <w:pPr>
+              <w:pStyle w:val="Normal"/>
+              <w:keepLines/>
+              <w:widowControl w:val="1"/>
+              <w:wordWrap w:val="0"/>
               <w:snapToGrid w:val="0"/>
               <w:spacing w:before="0" w:after="100" w:line="300" w:lineRule="exact"/>
-              <w:widowControl w:val="1"/>
+              <w:rPr>
+                <w:rFonts w:ascii="Palatino Linotype" w:hAnsi="Palatino Linotype"/>
+                <w:i/>
+                <w:iCs/>
+                <w:color w:val="FF0000"/>
+              </w:rPr>
             </w:pPr>
             <w:r>
               <w:rPr>
                 <w:color w:val="FF0000"/>
                 <w:rFonts w:ascii="Palatino Linotype" w:hAnsi="Palatino Linotype" w:eastAsia="SimSun" w:cs="Palatino Linotype"/>
-                <w:lang w:val="zh-CN" w:eastAsia="zh-CN"/>
-                <w:sz w:val="23"/>
-                <w:szCs w:val="23"/>
-              </w:rPr>
-              <w:t xml:space="preserve">修订稿及补充材料区分了已完成的分析检查与拟开展的实现及实地评估。稿件继续保持匿名。</w:t>
+                <w:lang w:val="en-US" w:eastAsia="zh-CN"/>
+                <w:sz w:val="23"/>
+                <w:szCs w:val="23"/>
+              </w:rPr>
+              <w:t xml:space="preserve">本文的分析结果涉及文献编码、确定性策略检查及应用层字节量计算。Fabric 部署和综合任务试验属于后续验证步骤。</w:t>
             </w:r>
           </w:p>
         </w:tc>

</xml_diff>

<commit_message>
Condense reviewer replies to summaries and point-by-point responses
</commit_message>
<xml_diff>
--- a/review/revision-1/Response-to-Reviewer-1-EN-ZH.docx
+++ b/review/revision-1/Response-to-Reviewer-1-EN-ZH.docx
@@ -114,7 +114,7 @@
                 <w:sz w:val="23"/>
                 <w:szCs w:val="23"/>
               </w:rPr>
-              <w:t xml:space="preserve">1. Summary</w:t>
+              <w:t xml:space="preserve">1 Summary</w:t>
             </w:r>
           </w:p>
           <w:p>
@@ -142,7 +142,7 @@
                 <w:sz w:val="23"/>
                 <w:szCs w:val="23"/>
               </w:rPr>
-              <w:t xml:space="preserve">1. 概述</w:t>
+              <w:t xml:space="preserve">1 总结</w:t>
             </w:r>
           </w:p>
         </w:tc>
@@ -178,7 +178,7 @@
                 <w:sz w:val="23"/>
                 <w:szCs w:val="23"/>
               </w:rPr>
-              <w:t xml:space="preserve">Thank you for reviewing the manuscript. We have applied OAL to 39 full-text mechanism studies, added a partition–revocation–reconciliation case and a specified ledger application, strengthened the witnessed-log comparison and consensus selection, and consolidated the discussion. Section, table and figure references below refer to the revised manuscript.</w:t>
+              <w:t xml:space="preserve">Thank you for reviewing the manuscript. We have applied OAL to the reviewed studies, added a coalition mission case and a concrete ledger application design, and strengthened the comparison with witnessed logs. We have also shortened the text and revised the figures and references. All locations below refer to the revised manuscript.</w:t>
             </w:r>
           </w:p>
           <w:p>
@@ -204,1040 +204,7 @@
                 <w:sz w:val="23"/>
                 <w:szCs w:val="23"/>
               </w:rPr>
-              <w:t xml:space="preserve">感谢您审阅本稿。我们已将 OAL 应用于 39 篇经全文核查的机制研究，补充了分区—撤销—协调恢复案例及具体的账本应用方案，强化了见证日志比较和共识选型，并整合了讨论。下文引用的章节、表格和图均对应修订稿。</w:t>
-            </w:r>
-          </w:p>
-        </w:tc>
-      </w:tr>
-      <w:tr>
-        <w:trPr>
-          <w:cantSplit/>
-        </w:trPr>
-        <w:tc>
-          <w:tcPr>
-            <w:tcW w:w="3913" w:type="dxa"/>
-          </w:tcPr>
-          <w:p>
-            <w:pPr>
-              <w:keepNext w:val="1"/>
-              <w:snapToGrid w:val="0"/>
-              <w:spacing w:before="0" w:after="60" w:line="300" w:lineRule="exact"/>
-              <w:rPr>
-                <w:rFonts w:ascii="Palatino Linotype" w:hAnsi="Palatino Linotype"/>
-                <w:b/>
-                <w:bCs/>
-              </w:rPr>
-            </w:pPr>
-            <w:r>
-              <w:rPr>
-                <w:rFonts w:ascii="Palatino Linotype" w:hAnsi="Palatino Linotype"/>
-                <w:b/>
-                <w:bCs/>
-              </w:rPr>
-              <w:t>2. Questions for General Evaluation</w:t>
-            </w:r>
-          </w:p>
-          <w:p>
-            <w:pPr>
-              <w:widowControl w:val="1"/>
-              <w:wordWrap w:val="0"/>
-              <w:snapToGrid w:val="0"/>
-              <w:spacing w:before="0" w:after="100" w:line="300" w:lineRule="exact"/>
-              <w:rPr>
-                <w:rFonts w:ascii="Palatino Linotype" w:hAnsi="Palatino Linotype"/>
-                <w:b/>
-                <w:bCs/>
-              </w:rPr>
-            </w:pPr>
-            <w:r>
-              <w:rPr>
-                <w:b/>
-                <w:bCs/>
-                <w:rFonts w:ascii="Palatino Linotype" w:hAnsi="Palatino Linotype" w:eastAsia="SimSun" w:cs="Palatino Linotype"/>
-                <w:lang w:val="en-US" w:eastAsia="zh-CN"/>
-                <w:sz w:val="23"/>
-                <w:szCs w:val="23"/>
-              </w:rPr>
-              <w:t xml:space="preserve">2. 总体评价问题</w:t>
-            </w:r>
-          </w:p>
-        </w:tc>
-        <w:tc>
-          <w:tcPr>
-            <w:tcW w:w="2745" w:type="dxa"/>
-          </w:tcPr>
-          <w:p>
-            <w:pPr>
-              <w:keepNext w:val="1"/>
-              <w:snapToGrid w:val="0"/>
-              <w:spacing w:before="0" w:after="60" w:line="300" w:lineRule="exact"/>
-              <w:rPr>
-                <w:rFonts w:ascii="Palatino Linotype" w:hAnsi="Palatino Linotype"/>
-                <w:b/>
-                <w:bCs/>
-              </w:rPr>
-            </w:pPr>
-            <w:r>
-              <w:rPr>
-                <w:rFonts w:ascii="Palatino Linotype" w:hAnsi="Palatino Linotype"/>
-                <w:b/>
-                <w:bCs/>
-              </w:rPr>
-              <w:t>Reviewer’s E</w:t>
-            </w:r>
-            <w:r>
-              <w:rPr>
-                <w:rFonts w:ascii="Palatino Linotype" w:eastAsiaTheme="minorEastAsia" w:hAnsi="Palatino Linotype"/>
-                <w:b/>
-                <w:bCs/>
-              </w:rPr>
-              <w:t>va</w:t>
-            </w:r>
-            <w:r>
-              <w:rPr>
-                <w:rFonts w:ascii="Palatino Linotype" w:hAnsi="Palatino Linotype"/>
-                <w:b/>
-                <w:bCs/>
-              </w:rPr>
-              <w:t>luation</w:t>
-            </w:r>
-          </w:p>
-          <w:p>
-            <w:pPr>
-              <w:widowControl w:val="1"/>
-              <w:wordWrap w:val="0"/>
-              <w:snapToGrid w:val="0"/>
-              <w:spacing w:before="0" w:after="100" w:line="300" w:lineRule="exact"/>
-              <w:rPr>
-                <w:rFonts w:ascii="Palatino Linotype" w:hAnsi="Palatino Linotype"/>
-                <w:b/>
-                <w:bCs/>
-              </w:rPr>
-            </w:pPr>
-            <w:r>
-              <w:rPr>
-                <w:b/>
-                <w:bCs/>
-                <w:rFonts w:ascii="Palatino Linotype" w:hAnsi="Palatino Linotype" w:eastAsia="SimSun" w:cs="Palatino Linotype"/>
-                <w:lang w:val="en-US" w:eastAsia="zh-CN"/>
-                <w:sz w:val="23"/>
-                <w:szCs w:val="23"/>
-              </w:rPr>
-              <w:t xml:space="preserve">审稿人的评价</w:t>
-            </w:r>
-          </w:p>
-        </w:tc>
-        <w:tc>
-          <w:tcPr>
-            <w:tcW w:w="2176" w:type="dxa"/>
-          </w:tcPr>
-          <w:p>
-            <w:pPr>
-              <w:keepNext w:val="1"/>
-              <w:snapToGrid w:val="0"/>
-              <w:spacing w:before="0" w:after="60" w:line="300" w:lineRule="exact"/>
-              <w:rPr>
-                <w:rFonts w:ascii="Palatino Linotype" w:hAnsi="Palatino Linotype"/>
-                <w:b/>
-                <w:bCs/>
-              </w:rPr>
-            </w:pPr>
-            <w:r>
-              <w:rPr>
-                <w:rFonts w:ascii="Palatino Linotype" w:hAnsi="Palatino Linotype"/>
-                <w:b/>
-                <w:bCs/>
-              </w:rPr>
-              <w:t>Response and Revisions</w:t>
-            </w:r>
-          </w:p>
-          <w:p>
-            <w:pPr>
-              <w:widowControl w:val="1"/>
-              <w:wordWrap w:val="0"/>
-              <w:snapToGrid w:val="0"/>
-              <w:spacing w:before="0" w:after="100" w:line="300" w:lineRule="exact"/>
-              <w:rPr>
-                <w:rFonts w:ascii="Palatino Linotype" w:hAnsi="Palatino Linotype"/>
-                <w:b/>
-                <w:bCs/>
-              </w:rPr>
-            </w:pPr>
-            <w:r>
-              <w:rPr>
-                <w:b/>
-                <w:bCs/>
-                <w:rFonts w:ascii="Palatino Linotype" w:hAnsi="Palatino Linotype" w:eastAsia="SimSun" w:cs="Palatino Linotype"/>
-                <w:lang w:val="en-US" w:eastAsia="zh-CN"/>
-                <w:sz w:val="23"/>
-                <w:szCs w:val="23"/>
-              </w:rPr>
-              <w:t xml:space="preserve">回复与修改</w:t>
-            </w:r>
-          </w:p>
-        </w:tc>
-      </w:tr>
-      <w:tr>
-        <w:trPr>
-          <w:cantSplit/>
-        </w:trPr>
-        <w:tc>
-          <w:tcPr>
-            <w:tcW w:w="3913" w:type="dxa"/>
-          </w:tcPr>
-          <w:p>
-            <w:pPr>
-              <w:pStyle w:val="Normal"/>
-              <w:keepNext w:val="1"/>
-              <w:keepLines/>
-              <w:widowControl w:val="1"/>
-              <w:snapToGrid w:val="0"/>
-              <w:spacing w:before="0" w:after="60" w:line="300" w:lineRule="exact"/>
-              <w:rPr>
-                <w:rFonts w:ascii="Palatino Linotype" w:hAnsi="Palatino Linotype"/>
-                <w:i/>
-                <w:iCs/>
-                <w:color w:val="FF0000"/>
-              </w:rPr>
-            </w:pPr>
-            <w:r>
-              <w:rPr>
-                <w:rFonts w:ascii="Palatino Linotype" w:hAnsi="Palatino Linotype"/>
-                <w:color w:val="000000"/>
-                <w:sz w:val="23"/>
-                <w:szCs w:val="23"/>
-              </w:rPr>
-              <w:t xml:space="preserve">Is the work a significant contribution to the field?</w:t>
-            </w:r>
-          </w:p>
-          <w:p>
-            <w:pPr>
-              <w:pStyle w:val="Normal"/>
-              <w:keepLines/>
-              <w:widowControl w:val="1"/>
-              <w:wordWrap w:val="0"/>
-              <w:snapToGrid w:val="0"/>
-              <w:spacing w:before="0" w:after="100" w:line="300" w:lineRule="exact"/>
-              <w:rPr>
-                <w:rFonts w:ascii="Palatino Linotype" w:hAnsi="Palatino Linotype"/>
-                <w:i/>
-                <w:iCs/>
-                <w:color w:val="FF0000"/>
-              </w:rPr>
-            </w:pPr>
-            <w:r>
-              <w:rPr>
-                <w:color w:val="000000"/>
-                <w:rFonts w:ascii="Palatino Linotype" w:hAnsi="Palatino Linotype" w:eastAsia="SimSun" w:cs="Palatino Linotype"/>
-                <w:lang w:val="en-US" w:eastAsia="zh-CN"/>
-                <w:sz w:val="23"/>
-                <w:szCs w:val="23"/>
-              </w:rPr>
-              <w:t xml:space="preserve">本研究是否对该领域作出了重要贡献？</w:t>
-            </w:r>
-          </w:p>
-        </w:tc>
-        <w:tc>
-          <w:tcPr>
-            <w:tcW w:w="2745" w:type="dxa"/>
-          </w:tcPr>
-          <w:p>
-            <w:pPr>
-              <w:pStyle w:val="Normal"/>
-              <w:keepNext w:val="1"/>
-              <w:keepLines/>
-              <w:widowControl w:val="1"/>
-              <w:snapToGrid w:val="0"/>
-              <w:spacing w:before="0" w:after="60" w:line="300" w:lineRule="exact"/>
-              <w:rPr>
-                <w:rFonts w:ascii="Palatino Linotype" w:hAnsi="Palatino Linotype"/>
-                <w:i/>
-                <w:iCs/>
-                <w:color w:val="FF0000"/>
-              </w:rPr>
-            </w:pPr>
-            <w:r>
-              <w:rPr>
-                <w:rFonts w:ascii="Palatino Linotype" w:hAnsi="Palatino Linotype"/>
-                <w:color w:val="000000"/>
-                <w:sz w:val="23"/>
-                <w:szCs w:val="23"/>
-              </w:rPr>
-              <w:t xml:space="preserve">3/5 stars</w:t>
-            </w:r>
-          </w:p>
-          <w:p>
-            <w:pPr>
-              <w:pStyle w:val="Normal"/>
-              <w:keepLines/>
-              <w:widowControl w:val="1"/>
-              <w:wordWrap w:val="0"/>
-              <w:snapToGrid w:val="0"/>
-              <w:spacing w:before="0" w:after="100" w:line="300" w:lineRule="exact"/>
-              <w:rPr>
-                <w:rFonts w:ascii="Palatino Linotype" w:hAnsi="Palatino Linotype"/>
-                <w:i/>
-                <w:iCs/>
-                <w:color w:val="FF0000"/>
-              </w:rPr>
-            </w:pPr>
-            <w:r>
-              <w:rPr>
-                <w:color w:val="000000"/>
-                <w:rFonts w:ascii="Palatino Linotype" w:hAnsi="Palatino Linotype" w:eastAsia="SimSun" w:cs="Palatino Linotype"/>
-                <w:lang w:val="en-US" w:eastAsia="zh-CN"/>
-                <w:sz w:val="23"/>
-                <w:szCs w:val="23"/>
-              </w:rPr>
-              <w:t xml:space="preserve">3/5 星</w:t>
-            </w:r>
-          </w:p>
-        </w:tc>
-        <w:tc>
-          <w:tcPr>
-            <w:tcW w:w="2176" w:type="dxa"/>
-          </w:tcPr>
-          <w:p>
-            <w:pPr>
-              <w:pStyle w:val="Normal"/>
-              <w:keepNext w:val="1"/>
-              <w:keepLines/>
-              <w:widowControl w:val="1"/>
-              <w:snapToGrid w:val="0"/>
-              <w:spacing w:before="0" w:after="60" w:line="300" w:lineRule="exact"/>
-              <w:rPr>
-                <w:rFonts w:ascii="Palatino Linotype" w:hAnsi="Palatino Linotype"/>
-                <w:i/>
-                <w:iCs/>
-                <w:color w:val="FF0000"/>
-              </w:rPr>
-            </w:pPr>
-            <w:r>
-              <w:rPr>
-                <w:rFonts w:ascii="Palatino Linotype" w:hAnsi="Palatino Linotype"/>
-                <w:color w:val="FF0000"/>
-                <w:sz w:val="23"/>
-                <w:szCs w:val="23"/>
-              </w:rPr>
-              <w:t xml:space="preserve">The full-text OAL application and ledger-relevant case are added; see Response 1.</w:t>
-            </w:r>
-          </w:p>
-          <w:p>
-            <w:pPr>
-              <w:pStyle w:val="Normal"/>
-              <w:keepLines/>
-              <w:widowControl w:val="1"/>
-              <w:wordWrap w:val="0"/>
-              <w:snapToGrid w:val="0"/>
-              <w:spacing w:before="0" w:after="100" w:line="300" w:lineRule="exact"/>
-              <w:rPr>
-                <w:rFonts w:ascii="Palatino Linotype" w:hAnsi="Palatino Linotype"/>
-                <w:i/>
-                <w:iCs/>
-                <w:color w:val="FF0000"/>
-              </w:rPr>
-            </w:pPr>
-            <w:r>
-              <w:rPr>
-                <w:color w:val="FF0000"/>
-                <w:rFonts w:ascii="Palatino Linotype" w:hAnsi="Palatino Linotype" w:eastAsia="SimSun" w:cs="Palatino Linotype"/>
-                <w:lang w:val="en-US" w:eastAsia="zh-CN"/>
-                <w:sz w:val="23"/>
-                <w:szCs w:val="23"/>
-              </w:rPr>
-              <w:t xml:space="preserve">已补充对全文研究的 OAL 应用及与账本相关的案例，详见回复 1。</w:t>
-            </w:r>
-          </w:p>
-        </w:tc>
-      </w:tr>
-      <w:tr>
-        <w:trPr>
-          <w:cantSplit/>
-        </w:trPr>
-        <w:tc>
-          <w:tcPr>
-            <w:tcW w:w="3913" w:type="dxa"/>
-          </w:tcPr>
-          <w:p>
-            <w:pPr>
-              <w:pStyle w:val="Normal"/>
-              <w:keepNext w:val="1"/>
-              <w:keepLines/>
-              <w:widowControl w:val="1"/>
-              <w:snapToGrid w:val="0"/>
-              <w:spacing w:before="0" w:after="60" w:line="300" w:lineRule="exact"/>
-              <w:rPr>
-                <w:rFonts w:ascii="Palatino Linotype" w:hAnsi="Palatino Linotype"/>
-                <w:i/>
-                <w:iCs/>
-                <w:color w:val="FF0000"/>
-              </w:rPr>
-            </w:pPr>
-            <w:r>
-              <w:rPr>
-                <w:rFonts w:ascii="Palatino Linotype" w:hAnsi="Palatino Linotype"/>
-                <w:color w:val="000000"/>
-                <w:sz w:val="23"/>
-                <w:szCs w:val="23"/>
-              </w:rPr>
-              <w:t xml:space="preserve">Is the work well organized and comprehensively described?</w:t>
-            </w:r>
-          </w:p>
-          <w:p>
-            <w:pPr>
-              <w:pStyle w:val="Normal"/>
-              <w:keepLines/>
-              <w:widowControl w:val="1"/>
-              <w:wordWrap w:val="0"/>
-              <w:snapToGrid w:val="0"/>
-              <w:spacing w:before="0" w:after="100" w:line="300" w:lineRule="exact"/>
-              <w:rPr>
-                <w:rFonts w:ascii="Palatino Linotype" w:hAnsi="Palatino Linotype"/>
-                <w:i/>
-                <w:iCs/>
-                <w:color w:val="FF0000"/>
-              </w:rPr>
-            </w:pPr>
-            <w:r>
-              <w:rPr>
-                <w:color w:val="000000"/>
-                <w:rFonts w:ascii="Palatino Linotype" w:hAnsi="Palatino Linotype" w:eastAsia="SimSun" w:cs="Palatino Linotype"/>
-                <w:lang w:val="en-US" w:eastAsia="zh-CN"/>
-                <w:sz w:val="23"/>
-                <w:szCs w:val="23"/>
-              </w:rPr>
-              <w:t xml:space="preserve">论文是否组织合理、描述全面？</w:t>
-            </w:r>
-          </w:p>
-        </w:tc>
-        <w:tc>
-          <w:tcPr>
-            <w:tcW w:w="2745" w:type="dxa"/>
-          </w:tcPr>
-          <w:p>
-            <w:pPr>
-              <w:pStyle w:val="Normal"/>
-              <w:keepNext w:val="1"/>
-              <w:keepLines/>
-              <w:widowControl w:val="1"/>
-              <w:snapToGrid w:val="0"/>
-              <w:spacing w:before="0" w:after="60" w:line="300" w:lineRule="exact"/>
-              <w:rPr>
-                <w:rFonts w:ascii="Palatino Linotype" w:hAnsi="Palatino Linotype"/>
-                <w:i/>
-                <w:iCs/>
-                <w:color w:val="FF0000"/>
-              </w:rPr>
-            </w:pPr>
-            <w:r>
-              <w:rPr>
-                <w:rFonts w:ascii="Palatino Linotype" w:hAnsi="Palatino Linotype"/>
-                <w:color w:val="000000"/>
-                <w:sz w:val="23"/>
-                <w:szCs w:val="23"/>
-              </w:rPr>
-              <w:t xml:space="preserve">4/5 stars</w:t>
-            </w:r>
-          </w:p>
-          <w:p>
-            <w:pPr>
-              <w:pStyle w:val="Normal"/>
-              <w:keepLines/>
-              <w:widowControl w:val="1"/>
-              <w:wordWrap w:val="0"/>
-              <w:snapToGrid w:val="0"/>
-              <w:spacing w:before="0" w:after="100" w:line="300" w:lineRule="exact"/>
-              <w:rPr>
-                <w:rFonts w:ascii="Palatino Linotype" w:hAnsi="Palatino Linotype"/>
-                <w:i/>
-                <w:iCs/>
-                <w:color w:val="FF0000"/>
-              </w:rPr>
-            </w:pPr>
-            <w:r>
-              <w:rPr>
-                <w:color w:val="000000"/>
-                <w:rFonts w:ascii="Palatino Linotype" w:hAnsi="Palatino Linotype" w:eastAsia="SimSun" w:cs="Palatino Linotype"/>
-                <w:lang w:val="en-US" w:eastAsia="zh-CN"/>
-                <w:sz w:val="23"/>
-                <w:szCs w:val="23"/>
-              </w:rPr>
-              <w:t xml:space="preserve">4/5 星</w:t>
-            </w:r>
-          </w:p>
-        </w:tc>
-        <w:tc>
-          <w:tcPr>
-            <w:tcW w:w="2176" w:type="dxa"/>
-          </w:tcPr>
-          <w:p>
-            <w:pPr>
-              <w:pStyle w:val="Normal"/>
-              <w:keepNext w:val="1"/>
-              <w:keepLines/>
-              <w:widowControl w:val="1"/>
-              <w:snapToGrid w:val="0"/>
-              <w:spacing w:before="0" w:after="60" w:line="300" w:lineRule="exact"/>
-              <w:rPr>
-                <w:rFonts w:ascii="Palatino Linotype" w:hAnsi="Palatino Linotype"/>
-                <w:i/>
-                <w:iCs/>
-                <w:color w:val="FF0000"/>
-              </w:rPr>
-            </w:pPr>
-            <w:r>
-              <w:rPr>
-                <w:rFonts w:ascii="Palatino Linotype" w:hAnsi="Palatino Linotype"/>
-                <w:color w:val="FF0000"/>
-                <w:sz w:val="23"/>
-                <w:szCs w:val="23"/>
-              </w:rPr>
-              <w:t xml:space="preserve">Methods, literature mapping and the worked case are integrated into Sections 2–7.</w:t>
-            </w:r>
-          </w:p>
-          <w:p>
-            <w:pPr>
-              <w:pStyle w:val="Normal"/>
-              <w:keepLines/>
-              <w:widowControl w:val="1"/>
-              <w:wordWrap w:val="0"/>
-              <w:snapToGrid w:val="0"/>
-              <w:spacing w:before="0" w:after="100" w:line="300" w:lineRule="exact"/>
-              <w:rPr>
-                <w:rFonts w:ascii="Palatino Linotype" w:hAnsi="Palatino Linotype"/>
-                <w:i/>
-                <w:iCs/>
-                <w:color w:val="FF0000"/>
-              </w:rPr>
-            </w:pPr>
-            <w:r>
-              <w:rPr>
-                <w:color w:val="FF0000"/>
-                <w:rFonts w:ascii="Palatino Linotype" w:hAnsi="Palatino Linotype" w:eastAsia="SimSun" w:cs="Palatino Linotype"/>
-                <w:lang w:val="en-US" w:eastAsia="zh-CN"/>
-                <w:sz w:val="23"/>
-                <w:szCs w:val="23"/>
-              </w:rPr>
-              <w:t xml:space="preserve">研究方法、文献映射及具体案例已整合到第 2—7 节。</w:t>
-            </w:r>
-          </w:p>
-        </w:tc>
-      </w:tr>
-      <w:tr>
-        <w:trPr>
-          <w:cantSplit/>
-        </w:trPr>
-        <w:tc>
-          <w:tcPr>
-            <w:tcW w:w="3913" w:type="dxa"/>
-          </w:tcPr>
-          <w:p>
-            <w:pPr>
-              <w:pStyle w:val="Normal"/>
-              <w:keepNext w:val="1"/>
-              <w:keepLines/>
-              <w:widowControl w:val="1"/>
-              <w:snapToGrid w:val="0"/>
-              <w:spacing w:before="0" w:after="60" w:line="300" w:lineRule="exact"/>
-              <w:rPr>
-                <w:rFonts w:ascii="Palatino Linotype" w:hAnsi="Palatino Linotype"/>
-                <w:i/>
-                <w:iCs/>
-                <w:color w:val="FF0000"/>
-              </w:rPr>
-            </w:pPr>
-            <w:r>
-              <w:rPr>
-                <w:rFonts w:ascii="Palatino Linotype" w:hAnsi="Palatino Linotype"/>
-                <w:color w:val="000000"/>
-                <w:sz w:val="23"/>
-                <w:szCs w:val="23"/>
-              </w:rPr>
-              <w:t xml:space="preserve">Is the work scientifically sound and not misleading?</w:t>
-            </w:r>
-          </w:p>
-          <w:p>
-            <w:pPr>
-              <w:pStyle w:val="Normal"/>
-              <w:keepLines/>
-              <w:widowControl w:val="1"/>
-              <w:wordWrap w:val="0"/>
-              <w:snapToGrid w:val="0"/>
-              <w:spacing w:before="0" w:after="100" w:line="300" w:lineRule="exact"/>
-              <w:rPr>
-                <w:rFonts w:ascii="Palatino Linotype" w:hAnsi="Palatino Linotype"/>
-                <w:i/>
-                <w:iCs/>
-                <w:color w:val="FF0000"/>
-              </w:rPr>
-            </w:pPr>
-            <w:r>
-              <w:rPr>
-                <w:color w:val="000000"/>
-                <w:rFonts w:ascii="Palatino Linotype" w:hAnsi="Palatino Linotype" w:eastAsia="SimSun" w:cs="Palatino Linotype"/>
-                <w:lang w:val="en-US" w:eastAsia="zh-CN"/>
-                <w:sz w:val="23"/>
-                <w:szCs w:val="23"/>
-              </w:rPr>
-              <w:t xml:space="preserve">研究在科学上是否严谨，且不存在误导？</w:t>
-            </w:r>
-          </w:p>
-        </w:tc>
-        <w:tc>
-          <w:tcPr>
-            <w:tcW w:w="2745" w:type="dxa"/>
-          </w:tcPr>
-          <w:p>
-            <w:pPr>
-              <w:pStyle w:val="Normal"/>
-              <w:keepNext w:val="1"/>
-              <w:keepLines/>
-              <w:widowControl w:val="1"/>
-              <w:snapToGrid w:val="0"/>
-              <w:spacing w:before="0" w:after="60" w:line="300" w:lineRule="exact"/>
-              <w:rPr>
-                <w:rFonts w:ascii="Palatino Linotype" w:hAnsi="Palatino Linotype"/>
-                <w:i/>
-                <w:iCs/>
-                <w:color w:val="FF0000"/>
-              </w:rPr>
-            </w:pPr>
-            <w:r>
-              <w:rPr>
-                <w:rFonts w:ascii="Palatino Linotype" w:hAnsi="Palatino Linotype"/>
-                <w:color w:val="000000"/>
-                <w:sz w:val="23"/>
-                <w:szCs w:val="23"/>
-              </w:rPr>
-              <w:t xml:space="preserve">4/5 stars</w:t>
-            </w:r>
-          </w:p>
-          <w:p>
-            <w:pPr>
-              <w:pStyle w:val="Normal"/>
-              <w:keepLines/>
-              <w:widowControl w:val="1"/>
-              <w:wordWrap w:val="0"/>
-              <w:snapToGrid w:val="0"/>
-              <w:spacing w:before="0" w:after="100" w:line="300" w:lineRule="exact"/>
-              <w:rPr>
-                <w:rFonts w:ascii="Palatino Linotype" w:hAnsi="Palatino Linotype"/>
-                <w:i/>
-                <w:iCs/>
-                <w:color w:val="FF0000"/>
-              </w:rPr>
-            </w:pPr>
-            <w:r>
-              <w:rPr>
-                <w:color w:val="000000"/>
-                <w:rFonts w:ascii="Palatino Linotype" w:hAnsi="Palatino Linotype" w:eastAsia="SimSun" w:cs="Palatino Linotype"/>
-                <w:lang w:val="en-US" w:eastAsia="zh-CN"/>
-                <w:sz w:val="23"/>
-                <w:szCs w:val="23"/>
-              </w:rPr>
-              <w:t xml:space="preserve">4/5 星</w:t>
-            </w:r>
-          </w:p>
-        </w:tc>
-        <w:tc>
-          <w:tcPr>
-            <w:tcW w:w="2176" w:type="dxa"/>
-          </w:tcPr>
-          <w:p>
-            <w:pPr>
-              <w:pStyle w:val="Normal"/>
-              <w:keepNext w:val="1"/>
-              <w:keepLines/>
-              <w:widowControl w:val="1"/>
-              <w:snapToGrid w:val="0"/>
-              <w:spacing w:before="0" w:after="60" w:line="300" w:lineRule="exact"/>
-              <w:rPr>
-                <w:rFonts w:ascii="Palatino Linotype" w:hAnsi="Palatino Linotype"/>
-                <w:i/>
-                <w:iCs/>
-                <w:color w:val="FF0000"/>
-              </w:rPr>
-            </w:pPr>
-            <w:r>
-              <w:rPr>
-                <w:rFonts w:ascii="Palatino Linotype" w:hAnsi="Palatino Linotype"/>
-                <w:color w:val="FF0000"/>
-                <w:sz w:val="23"/>
-                <w:szCs w:val="23"/>
-              </w:rPr>
-              <w:t xml:space="preserve">The replay scope and matched log comparison are stated explicitly.</w:t>
-            </w:r>
-          </w:p>
-          <w:p>
-            <w:pPr>
-              <w:pStyle w:val="Normal"/>
-              <w:keepLines/>
-              <w:widowControl w:val="1"/>
-              <w:wordWrap w:val="0"/>
-              <w:snapToGrid w:val="0"/>
-              <w:spacing w:before="0" w:after="100" w:line="300" w:lineRule="exact"/>
-              <w:rPr>
-                <w:rFonts w:ascii="Palatino Linotype" w:hAnsi="Palatino Linotype"/>
-                <w:i/>
-                <w:iCs/>
-                <w:color w:val="FF0000"/>
-              </w:rPr>
-            </w:pPr>
-            <w:r>
-              <w:rPr>
-                <w:color w:val="FF0000"/>
-                <w:rFonts w:ascii="Palatino Linotype" w:hAnsi="Palatino Linotype" w:eastAsia="SimSun" w:cs="Palatino Linotype"/>
-                <w:lang w:val="en-US" w:eastAsia="zh-CN"/>
-                <w:sz w:val="23"/>
-                <w:szCs w:val="23"/>
-              </w:rPr>
-              <w:t xml:space="preserve">已明确说明回放的验证范围，以及在匹配条件下与日志基线的比较。</w:t>
-            </w:r>
-          </w:p>
-        </w:tc>
-      </w:tr>
-      <w:tr>
-        <w:trPr>
-          <w:cantSplit/>
-        </w:trPr>
-        <w:tc>
-          <w:tcPr>
-            <w:tcW w:w="3913" w:type="dxa"/>
-          </w:tcPr>
-          <w:p>
-            <w:pPr>
-              <w:pStyle w:val="Normal"/>
-              <w:keepNext w:val="1"/>
-              <w:keepLines/>
-              <w:widowControl w:val="1"/>
-              <w:snapToGrid w:val="0"/>
-              <w:spacing w:before="0" w:after="60" w:line="300" w:lineRule="exact"/>
-              <w:rPr>
-                <w:rFonts w:ascii="Palatino Linotype" w:hAnsi="Palatino Linotype"/>
-                <w:i/>
-                <w:iCs/>
-                <w:color w:val="FF0000"/>
-              </w:rPr>
-            </w:pPr>
-            <w:r>
-              <w:rPr>
-                <w:rFonts w:ascii="Palatino Linotype" w:hAnsi="Palatino Linotype"/>
-                <w:color w:val="000000"/>
-                <w:sz w:val="23"/>
-                <w:szCs w:val="23"/>
-              </w:rPr>
-              <w:t xml:space="preserve">Are there appropriate and adequate references to related and previous work?</w:t>
-            </w:r>
-          </w:p>
-          <w:p>
-            <w:pPr>
-              <w:pStyle w:val="Normal"/>
-              <w:keepLines/>
-              <w:widowControl w:val="1"/>
-              <w:wordWrap w:val="0"/>
-              <w:snapToGrid w:val="0"/>
-              <w:spacing w:before="0" w:after="100" w:line="300" w:lineRule="exact"/>
-              <w:rPr>
-                <w:rFonts w:ascii="Palatino Linotype" w:hAnsi="Palatino Linotype"/>
-                <w:i/>
-                <w:iCs/>
-                <w:color w:val="FF0000"/>
-              </w:rPr>
-            </w:pPr>
-            <w:r>
-              <w:rPr>
-                <w:color w:val="000000"/>
-                <w:rFonts w:ascii="Palatino Linotype" w:hAnsi="Palatino Linotype" w:eastAsia="SimSun" w:cs="Palatino Linotype"/>
-                <w:lang w:val="en-US" w:eastAsia="zh-CN"/>
-                <w:sz w:val="23"/>
-                <w:szCs w:val="23"/>
-              </w:rPr>
-              <w:t xml:space="preserve">是否充分、恰当地引用了相关研究和既有工作？</w:t>
-            </w:r>
-          </w:p>
-        </w:tc>
-        <w:tc>
-          <w:tcPr>
-            <w:tcW w:w="2745" w:type="dxa"/>
-          </w:tcPr>
-          <w:p>
-            <w:pPr>
-              <w:pStyle w:val="Normal"/>
-              <w:keepNext w:val="1"/>
-              <w:keepLines/>
-              <w:widowControl w:val="1"/>
-              <w:snapToGrid w:val="0"/>
-              <w:spacing w:before="0" w:after="60" w:line="300" w:lineRule="exact"/>
-              <w:rPr>
-                <w:rFonts w:ascii="Palatino Linotype" w:hAnsi="Palatino Linotype"/>
-                <w:i/>
-                <w:iCs/>
-                <w:color w:val="FF0000"/>
-              </w:rPr>
-            </w:pPr>
-            <w:r>
-              <w:rPr>
-                <w:rFonts w:ascii="Palatino Linotype" w:hAnsi="Palatino Linotype"/>
-                <w:color w:val="000000"/>
-                <w:sz w:val="23"/>
-                <w:szCs w:val="23"/>
-              </w:rPr>
-              <w:t xml:space="preserve">5/5 stars</w:t>
-            </w:r>
-          </w:p>
-          <w:p>
-            <w:pPr>
-              <w:pStyle w:val="Normal"/>
-              <w:keepLines/>
-              <w:widowControl w:val="1"/>
-              <w:wordWrap w:val="0"/>
-              <w:snapToGrid w:val="0"/>
-              <w:spacing w:before="0" w:after="100" w:line="300" w:lineRule="exact"/>
-              <w:rPr>
-                <w:rFonts w:ascii="Palatino Linotype" w:hAnsi="Palatino Linotype"/>
-                <w:i/>
-                <w:iCs/>
-                <w:color w:val="FF0000"/>
-              </w:rPr>
-            </w:pPr>
-            <w:r>
-              <w:rPr>
-                <w:color w:val="000000"/>
-                <w:rFonts w:ascii="Palatino Linotype" w:hAnsi="Palatino Linotype" w:eastAsia="SimSun" w:cs="Palatino Linotype"/>
-                <w:lang w:val="en-US" w:eastAsia="zh-CN"/>
-                <w:sz w:val="23"/>
-                <w:szCs w:val="23"/>
-              </w:rPr>
-              <w:t xml:space="preserve">5/5 星</w:t>
-            </w:r>
-          </w:p>
-        </w:tc>
-        <w:tc>
-          <w:tcPr>
-            <w:tcW w:w="2176" w:type="dxa"/>
-          </w:tcPr>
-          <w:p>
-            <w:pPr>
-              <w:pStyle w:val="Normal"/>
-              <w:keepNext w:val="1"/>
-              <w:keepLines/>
-              <w:widowControl w:val="1"/>
-              <w:snapToGrid w:val="0"/>
-              <w:spacing w:before="0" w:after="60" w:line="300" w:lineRule="exact"/>
-              <w:rPr>
-                <w:rFonts w:ascii="Palatino Linotype" w:hAnsi="Palatino Linotype"/>
-                <w:i/>
-                <w:iCs/>
-                <w:color w:val="FF0000"/>
-              </w:rPr>
-            </w:pPr>
-            <w:r>
-              <w:rPr>
-                <w:rFonts w:ascii="Palatino Linotype" w:hAnsi="Palatino Linotype"/>
-                <w:color w:val="FF0000"/>
-                <w:sz w:val="23"/>
-                <w:szCs w:val="23"/>
-              </w:rPr>
-              <w:t xml:space="preserve">Thank you for this positive assessment.</w:t>
-            </w:r>
-          </w:p>
-          <w:p>
-            <w:pPr>
-              <w:pStyle w:val="Normal"/>
-              <w:keepLines/>
-              <w:widowControl w:val="1"/>
-              <w:wordWrap w:val="0"/>
-              <w:snapToGrid w:val="0"/>
-              <w:spacing w:before="0" w:after="100" w:line="300" w:lineRule="exact"/>
-              <w:rPr>
-                <w:rFonts w:ascii="Palatino Linotype" w:hAnsi="Palatino Linotype"/>
-                <w:i/>
-                <w:iCs/>
-                <w:color w:val="FF0000"/>
-              </w:rPr>
-            </w:pPr>
-            <w:r>
-              <w:rPr>
-                <w:color w:val="FF0000"/>
-                <w:rFonts w:ascii="Palatino Linotype" w:hAnsi="Palatino Linotype" w:eastAsia="SimSun" w:cs="Palatino Linotype"/>
-                <w:lang w:val="en-US" w:eastAsia="zh-CN"/>
-                <w:sz w:val="23"/>
-                <w:szCs w:val="23"/>
-              </w:rPr>
-              <w:t xml:space="preserve">感谢您给予这一积极评价。</w:t>
-            </w:r>
-          </w:p>
-        </w:tc>
-      </w:tr>
-      <w:tr>
-        <w:trPr>
-          <w:cantSplit/>
-        </w:trPr>
-        <w:tc>
-          <w:tcPr>
-            <w:tcW w:w="3913" w:type="dxa"/>
-          </w:tcPr>
-          <w:p>
-            <w:pPr>
-              <w:pStyle w:val="Normal"/>
-              <w:keepNext w:val="1"/>
-              <w:keepLines/>
-              <w:widowControl w:val="1"/>
-              <w:snapToGrid w:val="0"/>
-              <w:spacing w:before="0" w:after="60" w:line="300" w:lineRule="exact"/>
-              <w:rPr>
-                <w:rFonts w:ascii="Palatino Linotype" w:hAnsi="Palatino Linotype"/>
-                <w:i/>
-                <w:iCs/>
-                <w:color w:val="FF0000"/>
-              </w:rPr>
-            </w:pPr>
-            <w:r>
-              <w:rPr>
-                <w:rFonts w:ascii="Palatino Linotype" w:hAnsi="Palatino Linotype"/>
-                <w:color w:val="000000"/>
-                <w:sz w:val="23"/>
-                <w:szCs w:val="23"/>
-              </w:rPr>
-              <w:t xml:space="preserve">Is the English used correct and readable?</w:t>
-            </w:r>
-          </w:p>
-          <w:p>
-            <w:pPr>
-              <w:pStyle w:val="Normal"/>
-              <w:keepLines/>
-              <w:widowControl w:val="1"/>
-              <w:wordWrap w:val="0"/>
-              <w:snapToGrid w:val="0"/>
-              <w:spacing w:before="0" w:after="100" w:line="300" w:lineRule="exact"/>
-              <w:rPr>
-                <w:rFonts w:ascii="Palatino Linotype" w:hAnsi="Palatino Linotype"/>
-                <w:i/>
-                <w:iCs/>
-                <w:color w:val="FF0000"/>
-              </w:rPr>
-            </w:pPr>
-            <w:r>
-              <w:rPr>
-                <w:color w:val="000000"/>
-                <w:rFonts w:ascii="Palatino Linotype" w:hAnsi="Palatino Linotype" w:eastAsia="SimSun" w:cs="Palatino Linotype"/>
-                <w:lang w:val="en-US" w:eastAsia="zh-CN"/>
-                <w:sz w:val="23"/>
-                <w:szCs w:val="23"/>
-              </w:rPr>
-              <w:t xml:space="preserve">英语使用是否正确、易读？</w:t>
-            </w:r>
-          </w:p>
-        </w:tc>
-        <w:tc>
-          <w:tcPr>
-            <w:tcW w:w="2745" w:type="dxa"/>
-          </w:tcPr>
-          <w:p>
-            <w:pPr>
-              <w:pStyle w:val="Normal"/>
-              <w:keepNext w:val="1"/>
-              <w:keepLines/>
-              <w:widowControl w:val="1"/>
-              <w:snapToGrid w:val="0"/>
-              <w:spacing w:before="0" w:after="60" w:line="300" w:lineRule="exact"/>
-              <w:rPr>
-                <w:rFonts w:ascii="Palatino Linotype" w:hAnsi="Palatino Linotype"/>
-                <w:i/>
-                <w:iCs/>
-                <w:color w:val="FF0000"/>
-              </w:rPr>
-            </w:pPr>
-            <w:r>
-              <w:rPr>
-                <w:rFonts w:ascii="Palatino Linotype" w:hAnsi="Palatino Linotype"/>
-                <w:color w:val="000000"/>
-                <w:sz w:val="23"/>
-                <w:szCs w:val="23"/>
-              </w:rPr>
-              <w:t xml:space="preserve">The English is fine and does not require any improvement.</w:t>
-            </w:r>
-          </w:p>
-          <w:p>
-            <w:pPr>
-              <w:pStyle w:val="Normal"/>
-              <w:keepLines/>
-              <w:widowControl w:val="1"/>
-              <w:wordWrap w:val="0"/>
-              <w:snapToGrid w:val="0"/>
-              <w:spacing w:before="0" w:after="100" w:line="300" w:lineRule="exact"/>
-              <w:rPr>
-                <w:rFonts w:ascii="Palatino Linotype" w:hAnsi="Palatino Linotype"/>
-                <w:i/>
-                <w:iCs/>
-                <w:color w:val="FF0000"/>
-              </w:rPr>
-            </w:pPr>
-            <w:r>
-              <w:rPr>
-                <w:color w:val="000000"/>
-                <w:rFonts w:ascii="Palatino Linotype" w:hAnsi="Palatino Linotype" w:eastAsia="SimSun" w:cs="Palatino Linotype"/>
-                <w:lang w:val="en-US" w:eastAsia="zh-CN"/>
-                <w:sz w:val="23"/>
-                <w:szCs w:val="23"/>
-              </w:rPr>
-              <w:t xml:space="preserve">英语表达良好，无需改进。</w:t>
-            </w:r>
-          </w:p>
-        </w:tc>
-        <w:tc>
-          <w:tcPr>
-            <w:tcW w:w="2176" w:type="dxa"/>
-          </w:tcPr>
-          <w:p>
-            <w:pPr>
-              <w:pStyle w:val="Normal"/>
-              <w:keepNext w:val="1"/>
-              <w:keepLines/>
-              <w:widowControl w:val="1"/>
-              <w:snapToGrid w:val="0"/>
-              <w:spacing w:before="0" w:after="60" w:line="300" w:lineRule="exact"/>
-              <w:rPr>
-                <w:rFonts w:ascii="Palatino Linotype" w:hAnsi="Palatino Linotype"/>
-                <w:i/>
-                <w:iCs/>
-                <w:color w:val="FF0000"/>
-              </w:rPr>
-            </w:pPr>
-            <w:r>
-              <w:rPr>
-                <w:rFonts w:ascii="Palatino Linotype" w:hAnsi="Palatino Linotype"/>
-                <w:color w:val="FF0000"/>
-                <w:sz w:val="23"/>
-                <w:szCs w:val="23"/>
-              </w:rPr>
-              <w:t xml:space="preserve">Thank you. Minor edits improve consistency and concision.</w:t>
-            </w:r>
-          </w:p>
-          <w:p>
-            <w:pPr>
-              <w:pStyle w:val="Normal"/>
-              <w:keepLines/>
-              <w:widowControl w:val="1"/>
-              <w:wordWrap w:val="0"/>
-              <w:snapToGrid w:val="0"/>
-              <w:spacing w:before="0" w:after="100" w:line="300" w:lineRule="exact"/>
-              <w:rPr>
-                <w:rFonts w:ascii="Palatino Linotype" w:hAnsi="Palatino Linotype"/>
-                <w:i/>
-                <w:iCs/>
-                <w:color w:val="FF0000"/>
-              </w:rPr>
-            </w:pPr>
-            <w:r>
-              <w:rPr>
-                <w:color w:val="FF0000"/>
-                <w:rFonts w:ascii="Palatino Linotype" w:hAnsi="Palatino Linotype" w:eastAsia="SimSun" w:cs="Palatino Linotype"/>
-                <w:lang w:val="en-US" w:eastAsia="zh-CN"/>
-                <w:sz w:val="23"/>
-                <w:szCs w:val="23"/>
-              </w:rPr>
-              <w:t xml:space="preserve">感谢您。我们通过少量文字修改提高了表述的一致性和简洁性。</w:t>
+              <w:t xml:space="preserve">感谢您审阅稿件。我们已将 OAL 应用于所综述的研究，新增联盟任务案例及具体的账本应用设计，并加强与见证日志的比较。同时，我们压缩了正文，修改了图件和参考文献。下文所列位置均对应修改稿。</w:t>
             </w:r>
           </w:p>
         </w:tc>
@@ -1274,7 +241,7 @@
                 <w:sz w:val="23"/>
                 <w:szCs w:val="23"/>
               </w:rPr>
-              <w:t xml:space="preserve">3. Point-by-point response to Comments and Suggestions for Authors</w:t>
+              <w:t xml:space="preserve">2 Point by point response</w:t>
             </w:r>
           </w:p>
           <w:p>
@@ -1302,7 +269,7 @@
                 <w:sz w:val="23"/>
                 <w:szCs w:val="23"/>
               </w:rPr>
-              <w:t xml:space="preserve">3. 对作者意见和建议的逐条回复</w:t>
+              <w:t xml:space="preserve">2 逐条回复</w:t>
             </w:r>
           </w:p>
         </w:tc>
@@ -1401,7 +368,7 @@
                 <w:sz w:val="23"/>
                 <w:szCs w:val="23"/>
               </w:rPr>
-              <w:t xml:space="preserve">Response 1: Thank you for identifying the need to connect the framework to both the reviewed evidence and a ledger-relevant example. We have revised the manuscript in both respects.</w:t>
+              <w:t xml:space="preserve">Response 1: Sections 2 and 5 now apply OAL to 39 full-text studies through 89 claim records, with a coverage heatmap, evidence levels and sensitivity analyses (Figure 3; Tables 2, 5 and 6). Sections 6.4 and 7 add a partition–revocation–reconciliation case, specify a Fabric-oriented application design, and compare it with a policy-validating witnessed log. A synthetic replay checks the rules and payload requirements; Fabric deployment and integrated mission trials remain future validation. The revised text links ledger value to shared-governance requirements and reports equal decisions for the log under matched rules.</w:t>
             </w:r>
           </w:p>
           <w:p>
@@ -1427,572 +394,7 @@
                 <w:sz w:val="23"/>
                 <w:szCs w:val="23"/>
               </w:rPr>
-              <w:t xml:space="preserve">回复 1：感谢您指出，需要将框架同时与所综述的证据及账本相关实例联系起来。我们已从这两个方面修订论文。</w:t>
-            </w:r>
-          </w:p>
-        </w:tc>
-      </w:tr>
-      <w:tr>
-        <w:trPr>
-          <w:cantSplit/>
-        </w:trPr>
-        <w:tc>
-          <w:tcPr>
-            <w:tcW w:w="8834" w:type="dxa"/>
-            <w:gridSpan w:val="3"/>
-          </w:tcPr>
-          <w:p>
-            <w:pPr>
-              <w:pStyle w:val="Normal"/>
-              <w:keepNext w:val="1"/>
-              <w:keepLines/>
-              <w:widowControl w:val="1"/>
-              <w:snapToGrid w:val="0"/>
-              <w:spacing w:before="0" w:after="60" w:line="300" w:lineRule="exact"/>
-              <w:rPr>
-                <w:rFonts w:ascii="Palatino Linotype" w:hAnsi="Palatino Linotype"/>
-                <w:i/>
-                <w:iCs/>
-                <w:color w:val="FF0000"/>
-              </w:rPr>
-            </w:pPr>
-            <w:r>
-              <w:rPr>
-                <w:rFonts w:ascii="Palatino Linotype" w:hAnsi="Palatino Linotype"/>
-                <w:color w:val="FF0000"/>
-                <w:sz w:val="23"/>
-                <w:szCs w:val="23"/>
-              </w:rPr>
-              <w:t xml:space="preserve">OAL is applied to 39 full-text mechanism studies through 89 scoped claim records. Section 2 distinguishes the 19 domain-focused studies, 20 transferable mechanisms and the 123-reference bibliography. Table 2 identifies the study groups and their sources; Figure 3 presents the framework schematic beside the populated heatmap. Section 5.3 and Table 5 compare what AIS protection, observation corroboration, attestation, trust-aware routing and consensus support, and specify the evidence required at the next handover. Section 5.4 and Table 6 report domain stratification, study-exclusion and coding sensitivity, and the results of removing each of the 39 studies in turn. Zero cells denote no coded claim in this sample. The physical UAV-node experiment is identified as evidence of cooperation and path adaptation under its stated operating conditions.</w:t>
-            </w:r>
-          </w:p>
-          <w:p>
-            <w:pPr>
-              <w:pStyle w:val="Normal"/>
-              <w:keepLines/>
-              <w:widowControl w:val="1"/>
-              <w:wordWrap w:val="0"/>
-              <w:snapToGrid w:val="0"/>
-              <w:spacing w:before="0" w:after="100" w:line="300" w:lineRule="exact"/>
-              <w:rPr>
-                <w:rFonts w:ascii="Palatino Linotype" w:hAnsi="Palatino Linotype"/>
-                <w:i/>
-                <w:iCs/>
-                <w:color w:val="FF0000"/>
-              </w:rPr>
-            </w:pPr>
-            <w:r>
-              <w:rPr>
-                <w:color w:val="FF0000"/>
-                <w:rFonts w:ascii="Palatino Linotype" w:hAnsi="Palatino Linotype" w:eastAsia="SimSun" w:cs="Palatino Linotype"/>
-                <w:lang w:val="en-US" w:eastAsia="zh-CN"/>
-                <w:sz w:val="23"/>
-                <w:szCs w:val="23"/>
-              </w:rPr>
-              <w:t xml:space="preserve">我们通过 89 条限定范围的机制主张记录，将 OAL 应用于 39 篇经全文核查的机制研究。第 2 节区分了 19 篇面向具体应用领域的研究、20 篇提供可迁移机制的研究，以及包含 123 条文献的参考文献表。表 2 列出了各研究组及其文献来源；图 3 将框架示意图与填入数据的热图并列呈现。第 5.3 节和表 5 比较了 AIS 保护、观测佐证、远程证明、信任感知路由及共识机制所支持的内容，并明确下一次交接所需的证据。第 5.4 节和表 6 报告了领域分层、研究排除和编码选择的敏感性分析，以及依次删除 39 篇研究中每一篇后的结果。零值单元格表示本样本中没有相应的编码主张。实物 UAV 节点实验被列为在其所述运行条件下支持协作和路径自适应的证据。</w:t>
-            </w:r>
-          </w:p>
-        </w:tc>
-      </w:tr>
-      <w:tr>
-        <w:trPr>
-          <w:cantSplit/>
-        </w:trPr>
-        <w:tc>
-          <w:tcPr>
-            <w:tcW w:w="8834" w:type="dxa"/>
-            <w:gridSpan w:val="3"/>
-          </w:tcPr>
-          <w:p>
-            <w:pPr>
-              <w:pStyle w:val="Normal"/>
-              <w:keepNext w:val="1"/>
-              <w:keepLines/>
-              <w:widowControl w:val="1"/>
-              <w:snapToGrid w:val="0"/>
-              <w:spacing w:before="0" w:after="60" w:line="300" w:lineRule="exact"/>
-              <w:rPr>
-                <w:rFonts w:ascii="Palatino Linotype" w:hAnsi="Palatino Linotype"/>
-                <w:i/>
-                <w:iCs/>
-                <w:color w:val="FF0000"/>
-              </w:rPr>
-            </w:pPr>
-            <w:r>
-              <w:rPr>
-                <w:rFonts w:ascii="Palatino Linotype" w:hAnsi="Palatino Linotype"/>
-                <w:color w:val="FF0000"/>
-                <w:sz w:val="23"/>
-                <w:szCs w:val="23"/>
-              </w:rPr>
-              <w:t xml:space="preserve">Section 6.4 presents a coalition mission that loses its gateway connection, commits a shore-side key revocation, and reconciles records after reconnection. Event intervals before, overlapping and after the effective revocation time lead to historical eligibility, quarantine and rejection, respectively. The example distinguishes locally available delegation from global authority learned later. Table 8 compares these outcomes with a mean-score policy and a veto-aware scalar policy using the same features.</w:t>
-            </w:r>
-          </w:p>
-          <w:p>
-            <w:pPr>
-              <w:pStyle w:val="Normal"/>
-              <w:keepLines/>
-              <w:widowControl w:val="1"/>
-              <w:wordWrap w:val="0"/>
-              <w:snapToGrid w:val="0"/>
-              <w:spacing w:before="0" w:after="100" w:line="300" w:lineRule="exact"/>
-              <w:rPr>
-                <w:rFonts w:ascii="Palatino Linotype" w:hAnsi="Palatino Linotype"/>
-                <w:i/>
-                <w:iCs/>
-                <w:color w:val="FF0000"/>
-              </w:rPr>
-            </w:pPr>
-            <w:r>
-              <w:rPr>
-                <w:color w:val="FF0000"/>
-                <w:rFonts w:ascii="Palatino Linotype" w:hAnsi="Palatino Linotype" w:eastAsia="SimSun" w:cs="Palatino Linotype"/>
-                <w:lang w:val="en-US" w:eastAsia="zh-CN"/>
-                <w:sz w:val="23"/>
-                <w:szCs w:val="23"/>
-              </w:rPr>
-              <w:t xml:space="preserve">第 6.4 节给出一个联盟任务：网关连接中断，岸端提交密钥撤销，随后在重新连接后对记录进行协调处理。事件时间区间分别位于撤销生效时间之前、与之重叠及之后时，会分别得到可纳入历史审计、隔离待审和拒绝的结果。该案例区分了本地可用的委托授权与稍后获知的全局权限。表 8 使用相同的输入特征，将这些结果与均值评分策略和具有否决规则的标量策略进行比较。</w:t>
-            </w:r>
-          </w:p>
-        </w:tc>
-      </w:tr>
-      <w:tr>
-        <w:trPr>
-          <w:cantSplit/>
-        </w:trPr>
-        <w:tc>
-          <w:tcPr>
-            <w:tcW w:w="8834" w:type="dxa"/>
-            <w:gridSpan w:val="3"/>
-          </w:tcPr>
-          <w:p>
-            <w:pPr>
-              <w:pStyle w:val="Normal"/>
-              <w:keepNext w:val="1"/>
-              <w:keepLines/>
-              <w:widowControl w:val="1"/>
-              <w:snapToGrid w:val="0"/>
-              <w:spacing w:before="0" w:after="60" w:line="300" w:lineRule="exact"/>
-              <w:rPr>
-                <w:rFonts w:ascii="Palatino Linotype" w:hAnsi="Palatino Linotype"/>
-                <w:i/>
-                <w:iCs/>
-                <w:color w:val="FF0000"/>
-              </w:rPr>
-            </w:pPr>
-            <w:r>
-              <w:rPr>
-                <w:rFonts w:ascii="Palatino Linotype" w:hAnsi="Palatino Linotype"/>
-                <w:color w:val="FF0000"/>
-                <w:sz w:val="23"/>
-                <w:szCs w:val="23"/>
-              </w:rPr>
-              <w:t xml:space="preserve">Sections 7.2–7.4 specify the participating organizations, peer/orderer placement, joint endorsement policy, state keys, deterministic chaincode operations, receipt verification and communication budget. We executed a synthetic replay that checks signatures, Merkle inclusion, arrival-order and duplicate-delivery handling, and all 16 coalition signer subsets. We also calculated application-message sizes from the stated encoding and examined partition/deadline sensitivity under declared delay assumptions. These analyses test the specified rules and payload requirements; they do not measure Fabric deployment, consensus or integrated sea-trial performance.</w:t>
-            </w:r>
-          </w:p>
-          <w:p>
-            <w:pPr>
-              <w:pStyle w:val="Normal"/>
-              <w:keepLines/>
-              <w:widowControl w:val="1"/>
-              <w:wordWrap w:val="0"/>
-              <w:snapToGrid w:val="0"/>
-              <w:spacing w:before="0" w:after="100" w:line="300" w:lineRule="exact"/>
-              <w:rPr>
-                <w:rFonts w:ascii="Palatino Linotype" w:hAnsi="Palatino Linotype"/>
-                <w:i/>
-                <w:iCs/>
-                <w:color w:val="FF0000"/>
-              </w:rPr>
-            </w:pPr>
-            <w:r>
-              <w:rPr>
-                <w:color w:val="FF0000"/>
-                <w:rFonts w:ascii="Palatino Linotype" w:hAnsi="Palatino Linotype" w:eastAsia="SimSun" w:cs="Palatino Linotype"/>
-                <w:lang w:val="en-US" w:eastAsia="zh-CN"/>
-                <w:sz w:val="23"/>
-                <w:szCs w:val="23"/>
-              </w:rPr>
-              <w:t xml:space="preserve">第 7.2—7.4 节明确了参与组织、对等节点和排序节点的部署位置、联合背书策略、状态键、确定性链码操作、回执验证及通信预算。我们执行了合成回放，检查签名、Merkle 包含证明、乱序与重复消息处理，以及联盟签署者的全部 16 种子集。我们还根据所述编码计算了应用消息大小，并在明确的时延假设下分析了分区时长与截止时间的敏感性。这些分析检验的是所规定的规则和载荷需求，不涉及对 Fabric 部署、共识或综合海试性能的测量。</w:t>
-            </w:r>
-          </w:p>
-        </w:tc>
-      </w:tr>
-      <w:tr>
-        <w:trPr>
-          <w:cantSplit/>
-        </w:trPr>
-        <w:tc>
-          <w:tcPr>
-            <w:tcW w:w="8834" w:type="dxa"/>
-            <w:gridSpan w:val="3"/>
-          </w:tcPr>
-          <w:p>
-            <w:pPr>
-              <w:pStyle w:val="Normal"/>
-              <w:keepNext w:val="1"/>
-              <w:keepLines/>
-              <w:widowControl w:val="1"/>
-              <w:snapToGrid w:val="0"/>
-              <w:spacing w:before="0" w:after="60" w:line="300" w:lineRule="exact"/>
-              <w:rPr>
-                <w:rFonts w:ascii="Palatino Linotype" w:hAnsi="Palatino Linotype"/>
-                <w:i/>
-                <w:iCs/>
-                <w:color w:val="FF0000"/>
-              </w:rPr>
-            </w:pPr>
-            <w:r>
-              <w:rPr>
-                <w:rFonts w:ascii="Palatino Linotype" w:hAnsi="Palatino Linotype"/>
-                <w:color w:val="FF0000"/>
-                <w:sz w:val="23"/>
-                <w:szCs w:val="23"/>
-              </w:rPr>
-              <w:t xml:space="preserve">The abstract and Sections 7.1 and 11 state the ledger’s role in jointly governed commitments, policy state and reconciliation. A policy-validating witnessed log produces the same decisions under matched rules. Ledger value is therefore conditional on governance requirements and implementation cost. The coalition case connects this role to specific authorization rules and recovery operations.</w:t>
-            </w:r>
-          </w:p>
-          <w:p>
-            <w:pPr>
-              <w:pStyle w:val="Normal"/>
-              <w:keepLines/>
-              <w:widowControl w:val="1"/>
-              <w:wordWrap w:val="0"/>
-              <w:snapToGrid w:val="0"/>
-              <w:spacing w:before="0" w:after="100" w:line="300" w:lineRule="exact"/>
-              <w:rPr>
-                <w:rFonts w:ascii="Palatino Linotype" w:hAnsi="Palatino Linotype"/>
-                <w:i/>
-                <w:iCs/>
-                <w:color w:val="FF0000"/>
-              </w:rPr>
-            </w:pPr>
-            <w:r>
-              <w:rPr>
-                <w:color w:val="FF0000"/>
-                <w:rFonts w:ascii="Palatino Linotype" w:hAnsi="Palatino Linotype" w:eastAsia="SimSun" w:cs="Palatino Linotype"/>
-                <w:lang w:val="en-US" w:eastAsia="zh-CN"/>
-                <w:sz w:val="23"/>
-                <w:szCs w:val="23"/>
-              </w:rPr>
-              <w:t xml:space="preserve">摘要以及第 7.1 节和第 11 节说明了账本在共同治理的承诺记录、策略状态和协调恢复中的作用。在规则匹配的条件下，执行策略校验的见证日志会产生相同的决策。因此，账本的价值取决于治理需求和实现成本。联盟案例将这一作用落实到具体的授权规则和恢复操作中。</w:t>
-            </w:r>
-          </w:p>
-        </w:tc>
-      </w:tr>
-      <w:tr>
-        <w:trPr>
-          <w:cantSplit/>
-        </w:trPr>
-        <w:tc>
-          <w:tcPr>
-            <w:tcW w:w="8834" w:type="dxa"/>
-            <w:gridSpan w:val="3"/>
-          </w:tcPr>
-          <w:p>
-            <w:pPr>
-              <w:pStyle w:val="Normal"/>
-              <w:keepNext w:val="1"/>
-              <w:keepLines/>
-              <w:widowControl w:val="1"/>
-              <w:snapToGrid w:val="0"/>
-              <w:spacing w:before="0" w:after="60" w:line="300" w:lineRule="exact"/>
-              <w:rPr>
-                <w:rFonts w:ascii="Palatino Linotype" w:hAnsi="Palatino Linotype"/>
-                <w:i/>
-                <w:iCs/>
-                <w:color w:val="FF0000"/>
-              </w:rPr>
-            </w:pPr>
-            <w:r>
-              <w:rPr>
-                <w:rFonts w:ascii="Palatino Linotype" w:hAnsi="Palatino Linotype"/>
-                <w:color w:val="000000"/>
-                <w:b/>
-                <w:sz w:val="23"/>
-                <w:szCs w:val="23"/>
-              </w:rPr>
-              <w:t xml:space="preserve">4. Response to Comments on the Quality of English Language</w:t>
-            </w:r>
-          </w:p>
-          <w:p>
-            <w:pPr>
-              <w:pStyle w:val="Normal"/>
-              <w:keepNext/>
-              <w:keepLines/>
-              <w:widowControl w:val="1"/>
-              <w:wordWrap w:val="0"/>
-              <w:snapToGrid w:val="0"/>
-              <w:spacing w:before="0" w:after="100" w:line="300" w:lineRule="exact"/>
-              <w:rPr>
-                <w:rFonts w:ascii="Palatino Linotype" w:hAnsi="Palatino Linotype"/>
-                <w:i/>
-                <w:iCs/>
-                <w:color w:val="FF0000"/>
-              </w:rPr>
-            </w:pPr>
-            <w:r>
-              <w:rPr>
-                <w:color w:val="000000"/>
-                <w:b/>
-                <w:rFonts w:ascii="Palatino Linotype" w:hAnsi="Palatino Linotype" w:eastAsia="SimSun" w:cs="Palatino Linotype"/>
-                <w:lang w:val="en-US" w:eastAsia="zh-CN"/>
-                <w:sz w:val="23"/>
-                <w:szCs w:val="23"/>
-              </w:rPr>
-              <w:t xml:space="preserve">4. 对英语语言质量意见的回复</w:t>
-            </w:r>
-          </w:p>
-        </w:tc>
-      </w:tr>
-      <w:tr>
-        <w:trPr>
-          <w:cantSplit/>
-        </w:trPr>
-        <w:tc>
-          <w:tcPr>
-            <w:tcW w:w="8834" w:type="dxa"/>
-            <w:gridSpan w:val="3"/>
-          </w:tcPr>
-          <w:p>
-            <w:pPr>
-              <w:pStyle w:val="Normal"/>
-              <w:keepNext w:val="1"/>
-              <w:keepLines/>
-              <w:widowControl w:val="1"/>
-              <w:snapToGrid w:val="0"/>
-              <w:spacing w:before="0" w:after="60" w:line="300" w:lineRule="exact"/>
-              <w:rPr>
-                <w:rFonts w:ascii="Palatino Linotype" w:hAnsi="Palatino Linotype"/>
-                <w:i/>
-                <w:iCs/>
-                <w:color w:val="FF0000"/>
-              </w:rPr>
-            </w:pPr>
-            <w:r>
-              <w:rPr>
-                <w:rFonts w:ascii="Palatino Linotype" w:hAnsi="Palatino Linotype"/>
-                <w:color w:val="000000"/>
-                <w:sz w:val="23"/>
-                <w:szCs w:val="23"/>
-              </w:rPr>
-              <w:t xml:space="preserve">The English is fine and does not require any improvement.</w:t>
-            </w:r>
-          </w:p>
-          <w:p>
-            <w:pPr>
-              <w:pStyle w:val="Normal"/>
-              <w:keepNext/>
-              <w:keepLines/>
-              <w:widowControl w:val="1"/>
-              <w:wordWrap w:val="0"/>
-              <w:snapToGrid w:val="0"/>
-              <w:spacing w:before="0" w:after="100" w:line="300" w:lineRule="exact"/>
-              <w:rPr>
-                <w:rFonts w:ascii="Palatino Linotype" w:hAnsi="Palatino Linotype"/>
-                <w:i/>
-                <w:iCs/>
-                <w:color w:val="FF0000"/>
-              </w:rPr>
-            </w:pPr>
-            <w:r>
-              <w:rPr>
-                <w:color w:val="000000"/>
-                <w:rFonts w:ascii="Palatino Linotype" w:hAnsi="Palatino Linotype" w:eastAsia="SimSun" w:cs="Palatino Linotype"/>
-                <w:lang w:val="en-US" w:eastAsia="zh-CN"/>
-                <w:sz w:val="23"/>
-                <w:szCs w:val="23"/>
-              </w:rPr>
-              <w:t xml:space="preserve">英语表达良好，无需改进。</w:t>
-            </w:r>
-          </w:p>
-        </w:tc>
-      </w:tr>
-      <w:tr>
-        <w:trPr>
-          <w:cantSplit/>
-        </w:trPr>
-        <w:tc>
-          <w:tcPr>
-            <w:tcW w:w="8834" w:type="dxa"/>
-            <w:gridSpan w:val="3"/>
-          </w:tcPr>
-          <w:p>
-            <w:pPr>
-              <w:pStyle w:val="Normal"/>
-              <w:keepNext w:val="1"/>
-              <w:keepLines/>
-              <w:widowControl w:val="1"/>
-              <w:snapToGrid w:val="0"/>
-              <w:spacing w:before="0" w:after="60" w:line="300" w:lineRule="exact"/>
-              <w:rPr>
-                <w:rFonts w:ascii="Palatino Linotype" w:hAnsi="Palatino Linotype"/>
-                <w:i/>
-                <w:iCs/>
-                <w:color w:val="FF0000"/>
-              </w:rPr>
-            </w:pPr>
-            <w:r>
-              <w:rPr>
-                <w:rFonts w:ascii="Palatino Linotype" w:hAnsi="Palatino Linotype"/>
-                <w:color w:val="FF0000"/>
-                <w:sz w:val="23"/>
-                <w:szCs w:val="23"/>
-              </w:rPr>
-              <w:t xml:space="preserve">Response: Thank you for this assessment. We have made minor edits for consistency and concision while revising the manuscript.</w:t>
-            </w:r>
-          </w:p>
-          <w:p>
-            <w:pPr>
-              <w:pStyle w:val="Normal"/>
-              <w:keepLines/>
-              <w:widowControl w:val="1"/>
-              <w:wordWrap w:val="0"/>
-              <w:snapToGrid w:val="0"/>
-              <w:spacing w:before="0" w:after="100" w:line="300" w:lineRule="exact"/>
-              <w:rPr>
-                <w:rFonts w:ascii="Palatino Linotype" w:hAnsi="Palatino Linotype"/>
-                <w:i/>
-                <w:iCs/>
-                <w:color w:val="FF0000"/>
-              </w:rPr>
-            </w:pPr>
-            <w:r>
-              <w:rPr>
-                <w:color w:val="FF0000"/>
-                <w:rFonts w:ascii="Palatino Linotype" w:hAnsi="Palatino Linotype" w:eastAsia="SimSun" w:cs="Palatino Linotype"/>
-                <w:lang w:val="en-US" w:eastAsia="zh-CN"/>
-                <w:sz w:val="23"/>
-                <w:szCs w:val="23"/>
-              </w:rPr>
-              <w:t xml:space="preserve">回复：感谢您给予这一评价。修订论文时，我们进行了少量文字修改，以提高表述的一致性和简洁性。</w:t>
-            </w:r>
-          </w:p>
-        </w:tc>
-      </w:tr>
-      <w:tr>
-        <w:trPr>
-          <w:cantSplit/>
-        </w:trPr>
-        <w:tc>
-          <w:tcPr>
-            <w:tcW w:w="8834" w:type="dxa"/>
-            <w:gridSpan w:val="3"/>
-          </w:tcPr>
-          <w:p>
-            <w:pPr>
-              <w:pStyle w:val="Normal"/>
-              <w:keepNext w:val="1"/>
-              <w:keepLines/>
-              <w:widowControl w:val="1"/>
-              <w:snapToGrid w:val="0"/>
-              <w:spacing w:before="0" w:after="60" w:line="300" w:lineRule="exact"/>
-              <w:rPr>
-                <w:rFonts w:ascii="Palatino Linotype" w:hAnsi="Palatino Linotype"/>
-                <w:i/>
-                <w:iCs/>
-                <w:color w:val="FF0000"/>
-              </w:rPr>
-            </w:pPr>
-            <w:r>
-              <w:rPr>
-                <w:rFonts w:ascii="Palatino Linotype" w:hAnsi="Palatino Linotype"/>
-                <w:color w:val="000000"/>
-                <w:b/>
-                <w:sz w:val="23"/>
-                <w:szCs w:val="23"/>
-              </w:rPr>
-              <w:t xml:space="preserve">5. Additional clarifications</w:t>
-            </w:r>
-          </w:p>
-          <w:p>
-            <w:pPr>
-              <w:pStyle w:val="Normal"/>
-              <w:keepNext/>
-              <w:keepLines/>
-              <w:widowControl w:val="1"/>
-              <w:wordWrap w:val="0"/>
-              <w:snapToGrid w:val="0"/>
-              <w:spacing w:before="0" w:after="100" w:line="300" w:lineRule="exact"/>
-              <w:rPr>
-                <w:rFonts w:ascii="Palatino Linotype" w:hAnsi="Palatino Linotype"/>
-                <w:i/>
-                <w:iCs/>
-                <w:color w:val="FF0000"/>
-              </w:rPr>
-            </w:pPr>
-            <w:r>
-              <w:rPr>
-                <w:color w:val="000000"/>
-                <w:b/>
-                <w:rFonts w:ascii="Palatino Linotype" w:hAnsi="Palatino Linotype" w:eastAsia="SimSun" w:cs="Palatino Linotype"/>
-                <w:lang w:val="en-US" w:eastAsia="zh-CN"/>
-                <w:sz w:val="23"/>
-                <w:szCs w:val="23"/>
-              </w:rPr>
-              <w:t xml:space="preserve">5. 补充说明</w:t>
-            </w:r>
-          </w:p>
-        </w:tc>
-      </w:tr>
-      <w:tr>
-        <w:trPr>
-          <w:cantSplit/>
-        </w:trPr>
-        <w:tc>
-          <w:tcPr>
-            <w:tcW w:w="8834" w:type="dxa"/>
-            <w:gridSpan w:val="3"/>
-          </w:tcPr>
-          <w:p>
-            <w:pPr>
-              <w:pStyle w:val="Normal"/>
-              <w:keepNext w:val="1"/>
-              <w:keepLines/>
-              <w:widowControl w:val="1"/>
-              <w:snapToGrid w:val="0"/>
-              <w:spacing w:before="0" w:after="60" w:line="300" w:lineRule="exact"/>
-              <w:rPr>
-                <w:rFonts w:ascii="Palatino Linotype" w:hAnsi="Palatino Linotype"/>
-                <w:i/>
-                <w:iCs/>
-                <w:color w:val="FF0000"/>
-              </w:rPr>
-            </w:pPr>
-            <w:r>
-              <w:rPr>
-                <w:rFonts w:ascii="Palatino Linotype" w:hAnsi="Palatino Linotype"/>
-                <w:color w:val="FF0000"/>
-                <w:sz w:val="23"/>
-                <w:szCs w:val="23"/>
-              </w:rPr>
-              <w:t xml:space="preserve">The analytical results concern literature coding, deterministic policy checks and application-byte calculations. Fabric deployment and integrated mission trials are proposed validation steps.</w:t>
-            </w:r>
-          </w:p>
-          <w:p>
-            <w:pPr>
-              <w:pStyle w:val="Normal"/>
-              <w:keepLines/>
-              <w:widowControl w:val="1"/>
-              <w:wordWrap w:val="0"/>
-              <w:snapToGrid w:val="0"/>
-              <w:spacing w:before="0" w:after="100" w:line="300" w:lineRule="exact"/>
-              <w:rPr>
-                <w:rFonts w:ascii="Palatino Linotype" w:hAnsi="Palatino Linotype"/>
-                <w:i/>
-                <w:iCs/>
-                <w:color w:val="FF0000"/>
-              </w:rPr>
-            </w:pPr>
-            <w:r>
-              <w:rPr>
-                <w:color w:val="FF0000"/>
-                <w:rFonts w:ascii="Palatino Linotype" w:hAnsi="Palatino Linotype" w:eastAsia="SimSun" w:cs="Palatino Linotype"/>
-                <w:lang w:val="en-US" w:eastAsia="zh-CN"/>
-                <w:sz w:val="23"/>
-                <w:szCs w:val="23"/>
-              </w:rPr>
-              <w:t xml:space="preserve">本文的分析结果涉及文献编码、确定性策略检查及应用层字节量计算。Fabric 部署和综合任务试验属于后续验证步骤。</w:t>
+              <w:t xml:space="preserve">回复 1：第 2、5 节已将 OAL 应用于 39 篇全文研究中的 89 条主张记录，并给出覆盖热图、证据级别和敏感性分析（图 3；表 2、5、6）。第 6.4、7 节新增分区—撤销—协调恢复案例，明确面向 Fabric 的应用设计，并与具有策略校验能力的见证日志比较。合成回放检验规则与载荷需求；Fabric 部署和一体化任务试验仍有待后续验证。修改稿将账本价值与共同治理需求联系起来，并报告了日志在相同规则下得到相同决策的结果。</w:t>
             </w:r>
           </w:p>
         </w:tc>

</xml_diff>